<commit_message>
Apply meeting decisions: HITL theme, team size 2-4, schedule options
Decisions made with Bianca:
- Challenge theme: HUMAN IN THE LOOP (all projects must have meaningful
  human-agent interaction)
- Team size: 2-4 members
- BYOD: confirmed yes
- No LLM provider restrictions

Removed overly academic concept questions, replaced with practical
decisions. Added Friday evening vs Saturday morning schedule options.
Renumbered all open questions (now 13 total, down from 18).

Co-Authored-By: Claude Opus 4.6 (1M context) <noreply@anthropic.com>
</commit_message>
<xml_diff>
--- a/docs/hackathon-planning.docx
+++ b/docs/hackathon-planning.docx
@@ -2,7 +2,7 @@
 <file path=word/document.xml><?xml version="1.0" encoding="utf-8"?>
 <w:document xmlns:w="http://schemas.openxmlformats.org/wordprocessingml/2006/main" xmlns:m="http://schemas.openxmlformats.org/officeDocument/2006/math" xmlns:r="http://schemas.openxmlformats.org/officeDocument/2006/relationships" xmlns:o="urn:schemas-microsoft-com:office:office" xmlns:v="urn:schemas-microsoft-com:vml" xmlns:w10="urn:schemas-microsoft-com:office:word" xmlns:a="http://schemas.openxmlformats.org/drawingml/2006/main" xmlns:pic="http://schemas.openxmlformats.org/drawingml/2006/picture" xmlns:wp="http://schemas.openxmlformats.org/drawingml/2006/wordprocessingDrawing">
   <w:body>
-    <w:bookmarkStart w:id="102" w:name="X4d7b9d970ec1a05bfc08eabe5433d67eb94792b"/>
+    <w:bookmarkStart w:id="104" w:name="X4d7b9d970ec1a05bfc08eabe5433d67eb94792b"/>
     <w:p>
       <w:pPr>
         <w:pStyle w:val="Heading1"/>
@@ -111,7 +111,7 @@
         <w:t xml:space="preserve"> </w:t>
       </w:r>
       <w:r>
-        <w:t xml:space="preserve">Team-based (~25 teams of 4)</w:t>
+        <w:t xml:space="preserve">Team-based (teams of 2–4)</w:t>
       </w:r>
     </w:p>
     <w:p>
@@ -243,13 +243,160 @@
       </w:r>
     </w:p>
     <w:bookmarkEnd w:id="12"/>
-    <w:bookmarkStart w:id="13" w:name="open-questions-concept"/>
+    <w:bookmarkStart w:id="13" w:name="decisions-made"/>
     <w:p>
       <w:pPr>
         <w:pStyle w:val="Heading3"/>
       </w:pPr>
       <w:r>
-        <w:t xml:space="preserve">Open Questions — Concept</w:t>
+        <w:t xml:space="preserve">Decisions Made</w:t>
+      </w:r>
+    </w:p>
+    <w:p>
+      <w:pPr>
+        <w:pStyle w:val="Compact"/>
+        <w:numPr>
+          <w:ilvl w:val="0"/>
+          <w:numId w:val="1001"/>
+        </w:numPr>
+      </w:pPr>
+      <w:r>
+        <w:rPr>
+          <w:b/>
+          <w:bCs/>
+        </w:rPr>
+        <w:t xml:space="preserve">LLM providers:</w:t>
+      </w:r>
+      <w:r>
+        <w:t xml:space="preserve"> </w:t>
+      </w:r>
+      <w:r>
+        <w:t xml:space="preserve">No restrictions — teams choose their own stack. We supply credits from multiple providers.</w:t>
+      </w:r>
+    </w:p>
+    <w:p>
+      <w:pPr>
+        <w:pStyle w:val="Compact"/>
+        <w:numPr>
+          <w:ilvl w:val="0"/>
+          <w:numId w:val="1001"/>
+        </w:numPr>
+      </w:pPr>
+      <w:r>
+        <w:rPr>
+          <w:b/>
+          <w:bCs/>
+        </w:rPr>
+        <w:t xml:space="preserve">Challenge theme: HUMAN IN THE LOOP</w:t>
+      </w:r>
+      <w:r>
+        <w:t xml:space="preserve"> </w:t>
+      </w:r>
+      <w:r>
+        <w:t xml:space="preserve">— all projects must involve meaningful human-in-the-loop interaction with agents.</w:t>
+      </w:r>
+    </w:p>
+    <w:p>
+      <w:pPr>
+        <w:pStyle w:val="Compact"/>
+        <w:numPr>
+          <w:ilvl w:val="0"/>
+          <w:numId w:val="1001"/>
+        </w:numPr>
+      </w:pPr>
+      <w:r>
+        <w:rPr>
+          <w:b/>
+          <w:bCs/>
+        </w:rPr>
+        <w:t xml:space="preserve">BYOD:</w:t>
+      </w:r>
+      <w:r>
+        <w:t xml:space="preserve"> </w:t>
+      </w:r>
+      <w:r>
+        <w:t xml:space="preserve">Yes, students bring their own laptops.</w:t>
+      </w:r>
+    </w:p>
+    <w:p>
+      <w:r>
+        <w:pict>
+          <v:rect style="width:0;height:1.5pt" o:hralign="center" o:hrstd="t" o:hr="t"/>
+        </w:pict>
+      </w:r>
+    </w:p>
+    <w:bookmarkEnd w:id="13"/>
+    <w:bookmarkEnd w:id="14"/>
+    <w:bookmarkStart w:id="18" w:name="event-structure"/>
+    <w:p>
+      <w:pPr>
+        <w:pStyle w:val="Heading2"/>
+      </w:pPr>
+      <w:r>
+        <w:t xml:space="preserve">2. Event Structure</w:t>
+      </w:r>
+    </w:p>
+    <w:bookmarkStart w:id="15" w:name="decisions-made-1"/>
+    <w:p>
+      <w:pPr>
+        <w:pStyle w:val="Heading3"/>
+      </w:pPr>
+      <w:r>
+        <w:t xml:space="preserve">Decisions Made</w:t>
+      </w:r>
+    </w:p>
+    <w:p>
+      <w:pPr>
+        <w:pStyle w:val="Compact"/>
+        <w:numPr>
+          <w:ilvl w:val="0"/>
+          <w:numId w:val="1002"/>
+        </w:numPr>
+      </w:pPr>
+      <w:r>
+        <w:rPr>
+          <w:b/>
+          <w:bCs/>
+        </w:rPr>
+        <w:t xml:space="preserve">Team size:</w:t>
+      </w:r>
+      <w:r>
+        <w:t xml:space="preserve"> </w:t>
+      </w:r>
+      <w:r>
+        <w:t xml:space="preserve">2–4 members</w:t>
+      </w:r>
+    </w:p>
+    <w:p>
+      <w:pPr>
+        <w:pStyle w:val="Compact"/>
+        <w:numPr>
+          <w:ilvl w:val="0"/>
+          <w:numId w:val="1002"/>
+        </w:numPr>
+      </w:pPr>
+      <w:r>
+        <w:rPr>
+          <w:b/>
+          <w:bCs/>
+        </w:rPr>
+        <w:t xml:space="preserve">BYOD:</w:t>
+      </w:r>
+      <w:r>
+        <w:t xml:space="preserve"> </w:t>
+      </w:r>
+      <w:r>
+        <w:t xml:space="preserve">Yes, students bring their own laptops</w:t>
+      </w:r>
+    </w:p>
+    <w:bookmarkEnd w:id="15"/>
+    <w:bookmarkStart w:id="16" w:name="open-questions-event-structure"/>
+    <w:p>
+      <w:pPr>
+        <w:pStyle w:val="Heading3"/>
+      </w:pPr>
+      <w:r>
+        <w:t xml:space="preserve">Open Questions — Event Structure</w:t>
       </w:r>
     </w:p>
     <w:tbl>
@@ -337,88 +484,251 @@
                 <w:b/>
                 <w:bCs/>
               </w:rPr>
-              <w:t xml:space="preserve">What does</w:t>
-            </w:r>
+              <w:t xml:space="preserve">When do we start?</w:t>
+            </w:r>
+          </w:p>
+        </w:tc>
+        <w:tc>
+          <w:tcPr/>
+          <w:p>
+            <w:pPr>
+              <w:pStyle w:val="Compact"/>
+            </w:pPr>
+            <w:r>
+              <w:t xml:space="preserve">A) Friday evening. B) Saturday morning.</w:t>
+            </w:r>
+          </w:p>
+        </w:tc>
+        <w:tc>
+          <w:tcPr/>
+          <w:p>
+            <w:pPr>
+              <w:pStyle w:val="Compact"/>
+            </w:pPr>
+            <w:r>
+              <w:t xml:space="preserve">Friday evening gives more time but requires Friday logistics. Saturday morning is simpler but ~12 fewer hacking hours.</w:t>
+            </w:r>
+          </w:p>
+        </w:tc>
+      </w:tr>
+      <w:tr>
+        <w:tc>
+          <w:tcPr/>
+          <w:p>
+            <w:pPr>
+              <w:pStyle w:val="Compact"/>
+            </w:pPr>
+            <w:r>
+              <w:t xml:space="preserve">2</w:t>
+            </w:r>
+          </w:p>
+        </w:tc>
+        <w:tc>
+          <w:tcPr/>
+          <w:p>
+            <w:pPr>
+              <w:pStyle w:val="Compact"/>
+            </w:pPr>
             <w:r>
               <w:rPr>
                 <w:b/>
                 <w:bCs/>
               </w:rPr>
-              <w:t xml:space="preserve"> </w:t>
-            </w:r>
+              <w:t xml:space="preserve">Team formation — pre-formed or matchmaking?</w:t>
+            </w:r>
+          </w:p>
+        </w:tc>
+        <w:tc>
+          <w:tcPr/>
+          <w:p>
+            <w:pPr>
+              <w:pStyle w:val="Compact"/>
+            </w:pPr>
+            <w:r>
+              <w:t xml:space="preserve">A) Teams come pre-formed only. B) Matchmaking workshop on Day 1 for individuals. C) Mix — register as team or individual, we match individuals on Day 1.</w:t>
+            </w:r>
+          </w:p>
+        </w:tc>
+        <w:tc>
+          <w:tcPr/>
+          <w:p>
+            <w:pPr>
+              <w:pStyle w:val="Compact"/>
+            </w:pPr>
+            <w:r>
+              <w:t xml:space="preserve">If matchmaking: we need an icebreaker/team formation activity in the schedule.</w:t>
+            </w:r>
+          </w:p>
+        </w:tc>
+      </w:tr>
+      <w:tr>
+        <w:tc>
+          <w:tcPr/>
+          <w:p>
+            <w:pPr>
+              <w:pStyle w:val="Compact"/>
+            </w:pPr>
+            <w:r>
+              <w:t xml:space="preserve">3</w:t>
+            </w:r>
+          </w:p>
+        </w:tc>
+        <w:tc>
+          <w:tcPr/>
+          <w:p>
+            <w:pPr>
+              <w:pStyle w:val="Compact"/>
+            </w:pPr>
             <w:r>
               <w:rPr>
                 <w:b/>
                 <w:bCs/>
               </w:rPr>
-              <w:t xml:space="preserve">“agentic”</w:t>
-            </w:r>
+              <w:t xml:space="preserve">Venue — which university campus?</w:t>
+            </w:r>
+          </w:p>
+        </w:tc>
+        <w:tc>
+          <w:tcPr/>
+          <w:p>
+            <w:pPr>
+              <w:pStyle w:val="Compact"/>
+            </w:pPr>
+            <w:r>
+              <w:t xml:space="preserve">A) UPT campus. B) UVT campus. C) External venue.</w:t>
+            </w:r>
+          </w:p>
+        </w:tc>
+        <w:tc>
+          <w:tcPr/>
+          <w:p>
+            <w:pPr>
+              <w:pStyle w:val="Compact"/>
+            </w:pPr>
+            <w:r>
+              <w:t xml:space="preserve">Need: reliable WiFi for ~100 people, power outlets, projector, breakout rooms.</w:t>
+            </w:r>
+          </w:p>
+        </w:tc>
+      </w:tr>
+    </w:tbl>
+    <w:bookmarkEnd w:id="16"/>
+    <w:bookmarkStart w:id="17" w:name="schedule-tbd-depends-on-start-day"/>
+    <w:p>
+      <w:pPr>
+        <w:pStyle w:val="Heading3"/>
+      </w:pPr>
+      <w:r>
+        <w:t xml:space="preserve">Schedule (TBD — depends on start day)</w:t>
+      </w:r>
+    </w:p>
+    <w:p>
+      <w:pPr>
+        <w:pStyle w:val="FirstParagraph"/>
+      </w:pPr>
+      <w:r>
+        <w:rPr>
+          <w:b/>
+          <w:bCs/>
+        </w:rPr>
+        <w:t xml:space="preserve">Option A: Friday evening start</w:t>
+      </w:r>
+    </w:p>
+    <w:tbl>
+      <w:tblPr>
+        <w:tblStyle w:val="Table"/>
+        <w:tblW w:type="pct" w:w="5000"/>
+        <w:tblLayout w:type="fixed"/>
+        <w:tblLook w:firstRow="1" w:lastRow="0" w:firstColumn="0" w:lastColumn="0" w:noHBand="0" w:noVBand="0" w:val="0020"/>
+      </w:tblPr>
+      <w:tblGrid>
+        <w:gridCol w:w="3960"/>
+        <w:gridCol w:w="3960"/>
+      </w:tblGrid>
+      <w:tr>
+        <w:trPr>
+          <w:tblHeader w:val="on"/>
+        </w:trPr>
+        <w:tc>
+          <w:tcPr/>
+          <w:p>
+            <w:pPr>
+              <w:pStyle w:val="Compact"/>
+            </w:pPr>
+            <w:r>
+              <w:t xml:space="preserve">When</w:t>
+            </w:r>
+          </w:p>
+        </w:tc>
+        <w:tc>
+          <w:tcPr/>
+          <w:p>
+            <w:pPr>
+              <w:pStyle w:val="Compact"/>
+            </w:pPr>
+            <w:r>
+              <w:t xml:space="preserve">What</w:t>
+            </w:r>
+          </w:p>
+        </w:tc>
+      </w:tr>
+      <w:tr>
+        <w:tc>
+          <w:tcPr/>
+          <w:p>
+            <w:pPr>
+              <w:pStyle w:val="Compact"/>
+            </w:pPr>
             <w:r>
               <w:rPr>
                 <w:b/>
                 <w:bCs/>
               </w:rPr>
-              <w:t xml:space="preserve"> </w:t>
-            </w:r>
+              <w:t xml:space="preserve">Fri evening</w:t>
+            </w:r>
+          </w:p>
+        </w:tc>
+        <w:tc>
+          <w:tcPr/>
+          <w:p>
+            <w:pPr>
+              <w:pStyle w:val="Compact"/>
+            </w:pPr>
+            <w:r>
+              <w:t xml:space="preserve">Check-in, opening ceremony, workshops (LLM APIs, tool calling, agent patterns), challenge reveal, team formation (if matchmaking), hacking begins</w:t>
+            </w:r>
+          </w:p>
+        </w:tc>
+      </w:tr>
+      <w:tr>
+        <w:tc>
+          <w:tcPr/>
+          <w:p>
+            <w:pPr>
+              <w:pStyle w:val="Compact"/>
+            </w:pPr>
             <w:r>
               <w:rPr>
                 <w:b/>
                 <w:bCs/>
               </w:rPr>
-              <w:t xml:space="preserve">mean for this hackathon?</w:t>
-            </w:r>
-            <w:r>
-              <w:t xml:space="preserve"> </w:t>
-            </w:r>
-            <w:r>
-              <w:t xml:space="preserve">Should we define a minimum bar for what counts as an</w:t>
-            </w:r>
-            <w:r>
-              <w:t xml:space="preserve"> </w:t>
-            </w:r>
-            <w:r>
-              <w:t xml:space="preserve">“agent”</w:t>
-            </w:r>
-            <w:r>
-              <w:t xml:space="preserve">?</w:t>
-            </w:r>
-          </w:p>
-        </w:tc>
-        <w:tc>
-          <w:tcPr/>
-          <w:p>
-            <w:pPr>
-              <w:pStyle w:val="Compact"/>
-            </w:pPr>
-            <w:r>
-              <w:t xml:space="preserve">A) Must use tool calling / function calling. B) Must have a planning/reasoning loop (not just single-shot). C) Must involve multi-step autonomous action. D) Keep it loose — any LLM-powered app is fine.</w:t>
-            </w:r>
-          </w:p>
-        </w:tc>
-        <w:tc>
-          <w:tcPr/>
-          <w:p>
-            <w:pPr>
-              <w:pStyle w:val="Compact"/>
-            </w:pPr>
-            <w:r>
-              <w:t xml:space="preserve">Recommendation: Option B or C. Too loose and we get chatbot wrappers. Too strict and beginners can’t participate.</w:t>
-            </w:r>
-          </w:p>
-        </w:tc>
-      </w:tr>
-      <w:tr>
-        <w:tc>
-          <w:tcPr/>
-          <w:p>
-            <w:pPr>
-              <w:pStyle w:val="Compact"/>
-            </w:pPr>
-            <w:r>
-              <w:t xml:space="preserve">2</w:t>
-            </w:r>
-          </w:p>
-        </w:tc>
+              <w:t xml:space="preserve">Sat full day</w:t>
+            </w:r>
+          </w:p>
+        </w:tc>
+        <w:tc>
+          <w:tcPr/>
+          <w:p>
+            <w:pPr>
+              <w:pStyle w:val="Compact"/>
+            </w:pPr>
+            <w:r>
+              <w:t xml:space="preserve">Hacking, mentor sessions, midday check-in</w:t>
+            </w:r>
+          </w:p>
+        </w:tc>
+      </w:tr>
+      <w:tr>
         <w:tc>
           <w:tcPr/>
           <w:p>
@@ -430,45 +740,74 @@
                 <w:b/>
                 <w:bCs/>
               </w:rPr>
-              <w:t xml:space="preserve">Should we restrict which LLM providers students can use?</w:t>
-            </w:r>
-          </w:p>
-        </w:tc>
-        <w:tc>
-          <w:tcPr/>
-          <w:p>
-            <w:pPr>
-              <w:pStyle w:val="Compact"/>
-            </w:pPr>
-            <w:r>
-              <w:t xml:space="preserve">A) Only sponsors’ APIs (incentivizes sponsorship). B) Any provider, but we only supply credits for sponsors. C) Any provider, including open-source/local models.</w:t>
-            </w:r>
-          </w:p>
-        </w:tc>
-        <w:tc>
-          <w:tcPr/>
-          <w:p>
-            <w:pPr>
-              <w:pStyle w:val="Compact"/>
-            </w:pPr>
-            <w:r>
-              <w:t xml:space="preserve">Recommendation: Option C — don’t restrict at all, let teams choose their stack. Credits from multiple providers will be available.</w:t>
-            </w:r>
-          </w:p>
-        </w:tc>
-      </w:tr>
-      <w:tr>
-        <w:tc>
-          <w:tcPr/>
-          <w:p>
-            <w:pPr>
-              <w:pStyle w:val="Compact"/>
-            </w:pPr>
-            <w:r>
-              <w:t xml:space="preserve">3</w:t>
-            </w:r>
-          </w:p>
-        </w:tc>
+              <w:t xml:space="preserve">Sun morning</w:t>
+            </w:r>
+          </w:p>
+        </w:tc>
+        <w:tc>
+          <w:tcPr/>
+          <w:p>
+            <w:pPr>
+              <w:pStyle w:val="Compact"/>
+            </w:pPr>
+            <w:r>
+              <w:t xml:space="preserve">Final hacking, code freeze, demos, judging, awards, closing</w:t>
+            </w:r>
+          </w:p>
+        </w:tc>
+      </w:tr>
+    </w:tbl>
+    <w:p>
+      <w:pPr>
+        <w:pStyle w:val="BodyText"/>
+      </w:pPr>
+      <w:r>
+        <w:rPr>
+          <w:b/>
+          <w:bCs/>
+        </w:rPr>
+        <w:t xml:space="preserve">Option B: Saturday morning start</w:t>
+      </w:r>
+    </w:p>
+    <w:tbl>
+      <w:tblPr>
+        <w:tblStyle w:val="Table"/>
+        <w:tblW w:type="pct" w:w="5000"/>
+        <w:tblLayout w:type="fixed"/>
+        <w:tblLook w:firstRow="1" w:lastRow="0" w:firstColumn="0" w:lastColumn="0" w:noHBand="0" w:noVBand="0" w:val="0020"/>
+      </w:tblPr>
+      <w:tblGrid>
+        <w:gridCol w:w="3960"/>
+        <w:gridCol w:w="3960"/>
+      </w:tblGrid>
+      <w:tr>
+        <w:trPr>
+          <w:tblHeader w:val="on"/>
+        </w:trPr>
+        <w:tc>
+          <w:tcPr/>
+          <w:p>
+            <w:pPr>
+              <w:pStyle w:val="Compact"/>
+            </w:pPr>
+            <w:r>
+              <w:t xml:space="preserve">When</w:t>
+            </w:r>
+          </w:p>
+        </w:tc>
+        <w:tc>
+          <w:tcPr/>
+          <w:p>
+            <w:pPr>
+              <w:pStyle w:val="Compact"/>
+            </w:pPr>
+            <w:r>
+              <w:t xml:space="preserve">What</w:t>
+            </w:r>
+          </w:p>
+        </w:tc>
+      </w:tr>
+      <w:tr>
         <w:tc>
           <w:tcPr/>
           <w:p>
@@ -480,35 +819,74 @@
                 <w:b/>
                 <w:bCs/>
               </w:rPr>
-              <w:t xml:space="preserve">What’s the skill level assumption?</w:t>
-            </w:r>
-            <w:r>
-              <w:t xml:space="preserve"> </w:t>
-            </w:r>
-            <w:r>
-              <w:t xml:space="preserve">Most high schoolers won’t have API experience.</w:t>
-            </w:r>
-          </w:p>
-        </w:tc>
-        <w:tc>
-          <w:tcPr/>
-          <w:p>
-            <w:pPr>
-              <w:pStyle w:val="Compact"/>
-            </w:pPr>
-            <w:r>
-              <w:t xml:space="preserve">A) Assume zero experience — Day 1 is a full workshop. B) Require basic programming as prerequisite, teach APIs on Day 1. C) Provide starter templates/scaffolding so teams can focus on the agent logic.</w:t>
-            </w:r>
-          </w:p>
-        </w:tc>
-        <w:tc>
-          <w:tcPr/>
-          <w:p>
-            <w:pPr>
-              <w:pStyle w:val="Compact"/>
-            </w:pPr>
-            <w:r>
-              <w:t xml:space="preserve">Recommendation: B + C. Require basic Python/JS, provide starter code.</w:t>
+              <w:t xml:space="preserve">Sat morning</w:t>
+            </w:r>
+          </w:p>
+        </w:tc>
+        <w:tc>
+          <w:tcPr/>
+          <w:p>
+            <w:pPr>
+              <w:pStyle w:val="Compact"/>
+            </w:pPr>
+            <w:r>
+              <w:t xml:space="preserve">Check-in, opening, workshops, challenge reveal, team formation, hacking begins</w:t>
+            </w:r>
+          </w:p>
+        </w:tc>
+      </w:tr>
+      <w:tr>
+        <w:tc>
+          <w:tcPr/>
+          <w:p>
+            <w:pPr>
+              <w:pStyle w:val="Compact"/>
+            </w:pPr>
+            <w:r>
+              <w:rPr>
+                <w:b/>
+                <w:bCs/>
+              </w:rPr>
+              <w:t xml:space="preserve">Sat afternoon + evening</w:t>
+            </w:r>
+          </w:p>
+        </w:tc>
+        <w:tc>
+          <w:tcPr/>
+          <w:p>
+            <w:pPr>
+              <w:pStyle w:val="Compact"/>
+            </w:pPr>
+            <w:r>
+              <w:t xml:space="preserve">Hacking, mentor sessions</w:t>
+            </w:r>
+          </w:p>
+        </w:tc>
+      </w:tr>
+      <w:tr>
+        <w:tc>
+          <w:tcPr/>
+          <w:p>
+            <w:pPr>
+              <w:pStyle w:val="Compact"/>
+            </w:pPr>
+            <w:r>
+              <w:rPr>
+                <w:b/>
+                <w:bCs/>
+              </w:rPr>
+              <w:t xml:space="preserve">Sun morning</w:t>
+            </w:r>
+          </w:p>
+        </w:tc>
+        <w:tc>
+          <w:tcPr/>
+          <w:p>
+            <w:pPr>
+              <w:pStyle w:val="Compact"/>
+            </w:pPr>
+            <w:r>
+              <w:t xml:space="preserve">Final hacking, code freeze, demos, judging, awards, closing</w:t>
             </w:r>
           </w:p>
         </w:tc>
@@ -521,136 +899,58 @@
         </w:pict>
       </w:r>
     </w:p>
-    <w:bookmarkEnd w:id="13"/>
-    <w:bookmarkEnd w:id="14"/>
-    <w:bookmarkStart w:id="17" w:name="event-structure"/>
+    <w:bookmarkEnd w:id="17"/>
+    <w:bookmarkEnd w:id="18"/>
+    <w:bookmarkStart w:id="21" w:name="challenges-judging"/>
     <w:p>
       <w:pPr>
         <w:pStyle w:val="Heading2"/>
       </w:pPr>
       <w:r>
-        <w:t xml:space="preserve">2. Event Structure</w:t>
+        <w:t xml:space="preserve">3. Challenges &amp; Judging</w:t>
       </w:r>
     </w:p>
-    <w:bookmarkStart w:id="15" w:name="proposed-schedule"/>
+    <w:bookmarkStart w:id="19" w:name="challenge-theme-human-in-the-loop"/>
     <w:p>
       <w:pPr>
         <w:pStyle w:val="Heading3"/>
       </w:pPr>
       <w:r>
-        <w:t xml:space="preserve">Proposed Schedule</w:t>
+        <w:t xml:space="preserve">Challenge Theme: HUMAN IN THE LOOP</w:t>
       </w:r>
     </w:p>
     <w:p>
       <w:pPr>
         <w:pStyle w:val="FirstParagraph"/>
       </w:pPr>
+      <w:r>
+        <w:t xml:space="preserve">All projects must involve</w:t>
+      </w:r>
+      <w:r>
+        <w:t xml:space="preserve"> </w:t>
+      </w:r>
       <w:r>
         <w:rPr>
           <w:b/>
           <w:bCs/>
         </w:rPr>
-        <w:t xml:space="preserve">Day 1 — Friday, May 15</w:t>
+        <w:t xml:space="preserve">meaningful human-in-the-loop interaction</w:t>
       </w:r>
       <w:r>
         <w:t xml:space="preserve"> </w:t>
       </w:r>
       <w:r>
-        <w:t xml:space="preserve">- Morning: Check-in, opening ceremony, keynote</w:t>
-      </w:r>
-      <w:r>
-        <w:t xml:space="preserve"> </w:t>
-      </w:r>
-      <w:r>
-        <w:t xml:space="preserve">- Late morning: Workshops (intro to LLM APIs, tool calling, agent patterns)</w:t>
-      </w:r>
-      <w:r>
-        <w:t xml:space="preserve"> </w:t>
-      </w:r>
-      <w:r>
-        <w:t xml:space="preserve">- Afternoon: Challenge reveal, team formation, hacking begins</w:t>
-      </w:r>
-      <w:r>
-        <w:t xml:space="preserve"> </w:t>
-      </w:r>
-      <w:r>
-        <w:t xml:space="preserve">- Evening: Mentor office hours</w:t>
+        <w:t xml:space="preserve">with AI agents. This means the agent doesn’t just run autonomously — there are points where a human reviews, guides, approves, or collaborates with the agent. This is both a safety-conscious approach and a more realistic model of how agentic AI actually works in production.</w:t>
       </w:r>
     </w:p>
+    <w:bookmarkEnd w:id="19"/>
+    <w:bookmarkStart w:id="20" w:name="open-questions-challenges"/>
     <w:p>
       <w:pPr>
-        <w:pStyle w:val="BodyText"/>
-      </w:pPr>
-      <w:r>
-        <w:rPr>
-          <w:b/>
-          <w:bCs/>
-        </w:rPr>
-        <w:t xml:space="preserve">Day 2 — Saturday, May 16</w:t>
-      </w:r>
-      <w:r>
-        <w:t xml:space="preserve"> </w:t>
-      </w:r>
-      <w:r>
-        <w:t xml:space="preserve">- Full day: Hacking</w:t>
-      </w:r>
-      <w:r>
-        <w:t xml:space="preserve"> </w:t>
-      </w:r>
-      <w:r>
-        <w:t xml:space="preserve">- Midday: Check-in / progress demos (optional)</w:t>
-      </w:r>
-      <w:r>
-        <w:t xml:space="preserve"> </w:t>
-      </w:r>
-      <w:r>
-        <w:t xml:space="preserve">- Afternoon: Technical mentor sessions</w:t>
-      </w:r>
-      <w:r>
-        <w:t xml:space="preserve"> </w:t>
-      </w:r>
-      <w:r>
-        <w:t xml:space="preserve">- Evening: Social event / lightning talks</w:t>
-      </w:r>
-    </w:p>
-    <w:p>
-      <w:pPr>
-        <w:pStyle w:val="BodyText"/>
-      </w:pPr>
-      <w:r>
-        <w:rPr>
-          <w:b/>
-          <w:bCs/>
-        </w:rPr>
-        <w:t xml:space="preserve">Day 3 — Sunday, May 17</w:t>
-      </w:r>
-      <w:r>
-        <w:t xml:space="preserve"> </w:t>
-      </w:r>
-      <w:r>
-        <w:t xml:space="preserve">- Morning: Final hacking hours, code freeze</w:t>
-      </w:r>
-      <w:r>
-        <w:t xml:space="preserve"> </w:t>
-      </w:r>
-      <w:r>
-        <w:t xml:space="preserve">- Midday: Team presentations / demos</w:t>
-      </w:r>
-      <w:r>
-        <w:t xml:space="preserve"> </w:t>
-      </w:r>
-      <w:r>
-        <w:t xml:space="preserve">- Afternoon: Judging, awards ceremony, closing</w:t>
-      </w:r>
-    </w:p>
-    <w:bookmarkEnd w:id="15"/>
-    <w:bookmarkStart w:id="16" w:name="open-questions-event-structure"/>
-    <w:p>
-      <w:pPr>
         <w:pStyle w:val="Heading3"/>
       </w:pPr>
       <w:r>
-        <w:t xml:space="preserve">Open Questions — Event Structure</w:t>
+        <w:t xml:space="preserve">Open Questions — Challenges</w:t>
       </w:r>
     </w:p>
     <w:tbl>
@@ -738,30 +1038,33 @@
                 <w:b/>
                 <w:bCs/>
               </w:rPr>
-              <w:t xml:space="preserve">Venue — which university campus?</w:t>
-            </w:r>
-          </w:p>
-        </w:tc>
-        <w:tc>
-          <w:tcPr/>
-          <w:p>
-            <w:pPr>
-              <w:pStyle w:val="Compact"/>
-            </w:pPr>
-            <w:r>
-              <w:t xml:space="preserve">A) UPT campus. B) UVT campus. C) Shared/alternating. D) External venue (coworking, conference center).</w:t>
-            </w:r>
-          </w:p>
-        </w:tc>
-        <w:tc>
-          <w:tcPr/>
-          <w:p>
-            <w:pPr>
-              <w:pStyle w:val="Compact"/>
-            </w:pPr>
-            <w:r>
-              <w:t xml:space="preserve">Need: reliable WiFi for ~100 people, power outlets everywhere, projector, breakout rooms.</w:t>
-            </w:r>
+              <w:t xml:space="preserve">How specific should the challenge brief be?</w:t>
+            </w:r>
+          </w:p>
+        </w:tc>
+        <w:tc>
+          <w:tcPr/>
+          <w:p>
+            <w:pPr>
+              <w:pStyle w:val="Compact"/>
+            </w:pPr>
+            <w:r>
+              <w:t xml:space="preserve">A) Broad theme only (</w:t>
+            </w:r>
+            <w:r>
+              <w:t xml:space="preserve">“build a human-in-the-loop agent for X”</w:t>
+            </w:r>
+            <w:r>
+              <w:t xml:space="preserve">). B) 2–3 specific problem statements within the theme. C) Fully open — any human-in-the-loop agent.</w:t>
+            </w:r>
+          </w:p>
+        </w:tc>
+        <w:tc>
+          <w:tcPr/>
+          <w:p>
+            <w:pPr>
+              <w:pStyle w:val="Compact"/>
+            </w:pPr>
           </w:p>
         </w:tc>
       </w:tr>
@@ -774,335 +1077,6 @@
             </w:pPr>
             <w:r>
               <w:t xml:space="preserve">5</w:t>
-            </w:r>
-          </w:p>
-        </w:tc>
-        <w:tc>
-          <w:tcPr/>
-          <w:p>
-            <w:pPr>
-              <w:pStyle w:val="Compact"/>
-            </w:pPr>
-            <w:r>
-              <w:rPr>
-                <w:b/>
-                <w:bCs/>
-              </w:rPr>
-              <w:t xml:space="preserve">Team size?</w:t>
-            </w:r>
-          </w:p>
-        </w:tc>
-        <w:tc>
-          <w:tcPr/>
-          <w:p>
-            <w:pPr>
-              <w:pStyle w:val="Compact"/>
-            </w:pPr>
-            <w:r>
-              <w:t xml:space="preserve">A) 3 people. B) 4 people. C) 3–5 people (flexible).</w:t>
-            </w:r>
-          </w:p>
-        </w:tc>
-        <w:tc>
-          <w:tcPr/>
-          <w:p>
-            <w:pPr>
-              <w:pStyle w:val="Compact"/>
-            </w:pPr>
-            <w:r>
-              <w:t xml:space="preserve">Recommendation: 4 people. ~25 teams is manageable.</w:t>
-            </w:r>
-          </w:p>
-        </w:tc>
-      </w:tr>
-      <w:tr>
-        <w:tc>
-          <w:tcPr/>
-          <w:p>
-            <w:pPr>
-              <w:pStyle w:val="Compact"/>
-            </w:pPr>
-            <w:r>
-              <w:t xml:space="preserve">6</w:t>
-            </w:r>
-          </w:p>
-        </w:tc>
-        <w:tc>
-          <w:tcPr/>
-          <w:p>
-            <w:pPr>
-              <w:pStyle w:val="Compact"/>
-            </w:pPr>
-            <w:r>
-              <w:rPr>
-                <w:b/>
-                <w:bCs/>
-              </w:rPr>
-              <w:t xml:space="preserve">How do teams form?</w:t>
-            </w:r>
-          </w:p>
-        </w:tc>
-        <w:tc>
-          <w:tcPr/>
-          <w:p>
-            <w:pPr>
-              <w:pStyle w:val="Compact"/>
-            </w:pPr>
-            <w:r>
-              <w:t xml:space="preserve">A) Pre-formed teams only (register as a team). B) Solo registration, teams formed on Day 1. C) Mix — can register as team or individual, individuals matched on Day 1.</w:t>
-            </w:r>
-          </w:p>
-        </w:tc>
-        <w:tc>
-          <w:tcPr/>
-          <w:p>
-            <w:pPr>
-              <w:pStyle w:val="Compact"/>
-            </w:pPr>
-            <w:r>
-              <w:t xml:space="preserve">Recommendation: Option C — maximizes accessibility.</w:t>
-            </w:r>
-          </w:p>
-        </w:tc>
-      </w:tr>
-      <w:tr>
-        <w:tc>
-          <w:tcPr/>
-          <w:p>
-            <w:pPr>
-              <w:pStyle w:val="Compact"/>
-            </w:pPr>
-            <w:r>
-              <w:t xml:space="preserve">7</w:t>
-            </w:r>
-          </w:p>
-        </w:tc>
-        <w:tc>
-          <w:tcPr/>
-          <w:p>
-            <w:pPr>
-              <w:pStyle w:val="Compact"/>
-            </w:pPr>
-            <w:r>
-              <w:rPr>
-                <w:b/>
-                <w:bCs/>
-              </w:rPr>
-              <w:t xml:space="preserve">Do students bring their own laptops?</w:t>
-            </w:r>
-          </w:p>
-        </w:tc>
-        <w:tc>
-          <w:tcPr/>
-          <w:p>
-            <w:pPr>
-              <w:pStyle w:val="Compact"/>
-            </w:pPr>
-            <w:r>
-              <w:t xml:space="preserve">A) Yes, BYOD required. B) We provide workstations. C) BYOD preferred, but have backup machines available.</w:t>
-            </w:r>
-          </w:p>
-        </w:tc>
-        <w:tc>
-          <w:tcPr/>
-          <w:p>
-            <w:pPr>
-              <w:pStyle w:val="Compact"/>
-            </w:pPr>
-            <w:r>
-              <w:t xml:space="preserve">Recommendation: Option A with a few backup machines.</w:t>
-            </w:r>
-          </w:p>
-        </w:tc>
-      </w:tr>
-    </w:tbl>
-    <w:p>
-      <w:r>
-        <w:pict>
-          <v:rect style="width:0;height:1.5pt" o:hralign="center" o:hrstd="t" o:hr="t"/>
-        </w:pict>
-      </w:r>
-    </w:p>
-    <w:bookmarkEnd w:id="16"/>
-    <w:bookmarkEnd w:id="17"/>
-    <w:bookmarkStart w:id="19" w:name="challenges-judging"/>
-    <w:p>
-      <w:pPr>
-        <w:pStyle w:val="Heading2"/>
-      </w:pPr>
-      <w:r>
-        <w:t xml:space="preserve">3. Challenges &amp; Judging</w:t>
-      </w:r>
-    </w:p>
-    <w:bookmarkStart w:id="18" w:name="open-questions-challenges"/>
-    <w:p>
-      <w:pPr>
-        <w:pStyle w:val="Heading3"/>
-      </w:pPr>
-      <w:r>
-        <w:t xml:space="preserve">Open Questions — Challenges</w:t>
-      </w:r>
-    </w:p>
-    <w:tbl>
-      <w:tblPr>
-        <w:tblStyle w:val="Table"/>
-        <w:tblW w:type="pct" w:w="5000"/>
-        <w:tblLayout w:type="fixed"/>
-        <w:tblLook w:firstRow="1" w:lastRow="0" w:firstColumn="0" w:lastColumn="0" w:noHBand="0" w:noVBand="0" w:val="0020"/>
-      </w:tblPr>
-      <w:tblGrid>
-        <w:gridCol w:w="819"/>
-        <w:gridCol w:w="2731"/>
-        <w:gridCol w:w="2457"/>
-        <w:gridCol w:w="1911"/>
-      </w:tblGrid>
-      <w:tr>
-        <w:trPr>
-          <w:tblHeader w:val="on"/>
-        </w:trPr>
-        <w:tc>
-          <w:tcPr/>
-          <w:p>
-            <w:pPr>
-              <w:pStyle w:val="Compact"/>
-            </w:pPr>
-            <w:r>
-              <w:t xml:space="preserve">#</w:t>
-            </w:r>
-          </w:p>
-        </w:tc>
-        <w:tc>
-          <w:tcPr/>
-          <w:p>
-            <w:pPr>
-              <w:pStyle w:val="Compact"/>
-            </w:pPr>
-            <w:r>
-              <w:t xml:space="preserve">Question</w:t>
-            </w:r>
-          </w:p>
-        </w:tc>
-        <w:tc>
-          <w:tcPr/>
-          <w:p>
-            <w:pPr>
-              <w:pStyle w:val="Compact"/>
-            </w:pPr>
-            <w:r>
-              <w:t xml:space="preserve">Options</w:t>
-            </w:r>
-          </w:p>
-        </w:tc>
-        <w:tc>
-          <w:tcPr/>
-          <w:p>
-            <w:pPr>
-              <w:pStyle w:val="Compact"/>
-            </w:pPr>
-            <w:r>
-              <w:t xml:space="preserve">Notes</w:t>
-            </w:r>
-          </w:p>
-        </w:tc>
-      </w:tr>
-      <w:tr>
-        <w:tc>
-          <w:tcPr/>
-          <w:p>
-            <w:pPr>
-              <w:pStyle w:val="Compact"/>
-            </w:pPr>
-            <w:r>
-              <w:t xml:space="preserve">8</w:t>
-            </w:r>
-          </w:p>
-        </w:tc>
-        <w:tc>
-          <w:tcPr/>
-          <w:p>
-            <w:pPr>
-              <w:pStyle w:val="Compact"/>
-            </w:pPr>
-            <w:r>
-              <w:rPr>
-                <w:b/>
-                <w:bCs/>
-              </w:rPr>
-              <w:t xml:space="preserve">Challenge format — tracks or open?</w:t>
-            </w:r>
-          </w:p>
-        </w:tc>
-        <w:tc>
-          <w:tcPr/>
-          <w:p>
-            <w:pPr>
-              <w:pStyle w:val="Compact"/>
-            </w:pPr>
-            <w:r>
-              <w:t xml:space="preserve">A) 2–3 defined tracks (e.g.,</w:t>
-            </w:r>
-            <w:r>
-              <w:t xml:space="preserve"> </w:t>
-            </w:r>
-            <w:r>
-              <w:t xml:space="preserve">“research agent”</w:t>
-            </w:r>
-            <w:r>
-              <w:t xml:space="preserve">,</w:t>
-            </w:r>
-            <w:r>
-              <w:t xml:space="preserve"> </w:t>
-            </w:r>
-            <w:r>
-              <w:t xml:space="preserve">“data agent”</w:t>
-            </w:r>
-            <w:r>
-              <w:t xml:space="preserve">,</w:t>
-            </w:r>
-            <w:r>
-              <w:t xml:space="preserve"> </w:t>
-            </w:r>
-            <w:r>
-              <w:t xml:space="preserve">“creative agent”</w:t>
-            </w:r>
-            <w:r>
-              <w:t xml:space="preserve">) — teams pick one. B) Single open challenge —</w:t>
-            </w:r>
-            <w:r>
-              <w:t xml:space="preserve"> </w:t>
-            </w:r>
-            <w:r>
-              <w:t xml:space="preserve">“build the best agent for X domain.”</w:t>
-            </w:r>
-            <w:r>
-              <w:t xml:space="preserve"> </w:t>
-            </w:r>
-            <w:r>
-              <w:t xml:space="preserve">C) Fully open — build any agent you want.</w:t>
-            </w:r>
-          </w:p>
-        </w:tc>
-        <w:tc>
-          <w:tcPr/>
-          <w:p>
-            <w:pPr>
-              <w:pStyle w:val="Compact"/>
-            </w:pPr>
-            <w:r>
-              <w:t xml:space="preserve">Recommendation: Option A gives structure while allowing creativity.</w:t>
-            </w:r>
-          </w:p>
-        </w:tc>
-      </w:tr>
-      <w:tr>
-        <w:tc>
-          <w:tcPr/>
-          <w:p>
-            <w:pPr>
-              <w:pStyle w:val="Compact"/>
-            </w:pPr>
-            <w:r>
-              <w:t xml:space="preserve">9</w:t>
             </w:r>
           </w:p>
         </w:tc>
@@ -1134,31 +1108,31 @@
               <w:pStyle w:val="Compact"/>
             </w:pPr>
             <w:r>
-              <w:t xml:space="preserve">A) Technical sophistication (agent architecture, tool use, reasoning). B) Impact / usefulness (does it solve a real problem?). C) Creativity / novelty. D) Balanced scorecard across all three.</w:t>
-            </w:r>
-          </w:p>
-        </w:tc>
-        <w:tc>
-          <w:tcPr/>
-          <w:p>
-            <w:pPr>
-              <w:pStyle w:val="Compact"/>
-            </w:pPr>
-            <w:r>
-              <w:t xml:space="preserve">Recommendation: Option D with weights (e.g., 40% technical, 30% impact, 30% creativity).</w:t>
-            </w:r>
-          </w:p>
-        </w:tc>
-      </w:tr>
-      <w:tr>
-        <w:tc>
-          <w:tcPr/>
-          <w:p>
-            <w:pPr>
-              <w:pStyle w:val="Compact"/>
-            </w:pPr>
-            <w:r>
-              <w:t xml:space="preserve">10</w:t>
+              <w:t xml:space="preserve">A) Technical sophistication (agent architecture, tool use, reasoning). B) Impact / usefulness (does it solve a real problem?). C) Quality of the human-in-the-loop design. D) Balanced scorecard across all.</w:t>
+            </w:r>
+          </w:p>
+        </w:tc>
+        <w:tc>
+          <w:tcPr/>
+          <w:p>
+            <w:pPr>
+              <w:pStyle w:val="Compact"/>
+            </w:pPr>
+            <w:r>
+              <w:t xml:space="preserve">Suggestion: weight the human-in-the-loop design heavily since it’s the theme.</w:t>
+            </w:r>
+          </w:p>
+        </w:tc>
+      </w:tr>
+      <w:tr>
+        <w:tc>
+          <w:tcPr/>
+          <w:p>
+            <w:pPr>
+              <w:pStyle w:val="Compact"/>
+            </w:pPr>
+            <w:r>
+              <w:t xml:space="preserve">6</w:t>
             </w:r>
           </w:p>
         </w:tc>
@@ -1184,7 +1158,7 @@
               <w:pStyle w:val="Compact"/>
             </w:pPr>
             <w:r>
-              <w:t xml:space="preserve">A) Overall winners only (1st, 2nd, 3rd). B) Per-track winners + overall. C) Category awards (Best Technical, Most Creative, Best Pitch, etc.). D) Mix of B and C.</w:t>
+              <w:t xml:space="preserve">A) Overall winners only (1st, 2nd, 3rd). B) Category awards (Best Technical, Most Creative, Best UX, Best Pitch). C) Mix of both.</w:t>
             </w:r>
           </w:p>
         </w:tc>
@@ -1205,9 +1179,9 @@
         </w:pict>
       </w:r>
     </w:p>
-    <w:bookmarkEnd w:id="18"/>
-    <w:bookmarkEnd w:id="19"/>
-    <w:bookmarkStart w:id="89" w:name="llm-api-credits"/>
+    <w:bookmarkEnd w:id="20"/>
+    <w:bookmarkEnd w:id="21"/>
+    <w:bookmarkStart w:id="91" w:name="llm-api-credits"/>
     <w:p>
       <w:pPr>
         <w:pStyle w:val="Heading2"/>
@@ -1234,7 +1208,7 @@
         <w:t xml:space="preserve">Credits are the core resource students need.</w:t>
       </w:r>
     </w:p>
-    <w:bookmarkStart w:id="20" w:name="the-good-news-credits-are-not-a-blocker"/>
+    <w:bookmarkStart w:id="22" w:name="the-good-news-credits-are-not-a-blocker"/>
     <w:p>
       <w:pPr>
         <w:pStyle w:val="Heading3"/>
@@ -1251,8 +1225,8 @@
         <w:t xml:space="preserve">Deep research shows the credit problem is solvable through multiple independent paths. Self-serve signups alone yield ~$14,000 in credits before any sponsorship.</w:t>
       </w:r>
     </w:p>
-    <w:bookmarkEnd w:id="20"/>
-    <w:bookmarkStart w:id="22" w:name="credit-budget"/>
+    <w:bookmarkEnd w:id="22"/>
+    <w:bookmarkStart w:id="24" w:name="credit-budget"/>
     <w:p>
       <w:pPr>
         <w:pStyle w:val="Heading3"/>
@@ -1368,7 +1342,7 @@
             <w:r>
               <w:t xml:space="preserve">$5–15 (</w:t>
             </w:r>
-            <w:hyperlink r:id="rId21">
+            <w:hyperlink r:id="rId23">
               <w:r>
                 <w:rPr>
                   <w:rStyle w:val="Hyperlink"/>
@@ -1477,8 +1451,8 @@
         </w:tc>
       </w:tr>
     </w:tbl>
-    <w:bookmarkEnd w:id="22"/>
-    <w:bookmarkStart w:id="40" w:name="X62ca9a898d0c5ab6283662f290afe2dc02268fb"/>
+    <w:bookmarkEnd w:id="24"/>
+    <w:bookmarkStart w:id="42" w:name="X62ca9a898d0c5ab6283662f290afe2dc02268fb"/>
     <w:p>
       <w:pPr>
         <w:pStyle w:val="Heading3"/>
@@ -1628,7 +1602,7 @@
             <w:pPr>
               <w:pStyle w:val="Compact"/>
             </w:pPr>
-            <w:hyperlink r:id="rId23">
+            <w:hyperlink r:id="rId25">
               <w:r>
                 <w:rPr>
                   <w:rStyle w:val="Hyperlink"/>
@@ -1642,7 +1616,7 @@
             <w:r>
               <w:t xml:space="preserve"> </w:t>
             </w:r>
-            <w:hyperlink r:id="rId24">
+            <w:hyperlink r:id="rId26">
               <w:r>
                 <w:rPr>
                   <w:rStyle w:val="Hyperlink"/>
@@ -1712,7 +1686,7 @@
             <w:pPr>
               <w:pStyle w:val="Compact"/>
             </w:pPr>
-            <w:hyperlink r:id="rId25">
+            <w:hyperlink r:id="rId27">
               <w:r>
                 <w:rPr>
                   <w:rStyle w:val="Hyperlink"/>
@@ -1726,7 +1700,7 @@
             <w:r>
               <w:t xml:space="preserve"> </w:t>
             </w:r>
-            <w:hyperlink r:id="rId26">
+            <w:hyperlink r:id="rId28">
               <w:r>
                 <w:rPr>
                   <w:rStyle w:val="Hyperlink"/>
@@ -1796,7 +1770,7 @@
             <w:pPr>
               <w:pStyle w:val="Compact"/>
             </w:pPr>
-            <w:hyperlink r:id="rId27">
+            <w:hyperlink r:id="rId29">
               <w:r>
                 <w:rPr>
                   <w:rStyle w:val="Hyperlink"/>
@@ -1810,7 +1784,7 @@
             <w:r>
               <w:t xml:space="preserve"> </w:t>
             </w:r>
-            <w:hyperlink r:id="rId28">
+            <w:hyperlink r:id="rId30">
               <w:r>
                 <w:rPr>
                   <w:rStyle w:val="Hyperlink"/>
@@ -1880,7 +1854,7 @@
             <w:pPr>
               <w:pStyle w:val="Compact"/>
             </w:pPr>
-            <w:hyperlink r:id="rId29">
+            <w:hyperlink r:id="rId31">
               <w:r>
                 <w:rPr>
                   <w:rStyle w:val="Hyperlink"/>
@@ -1894,7 +1868,7 @@
             <w:r>
               <w:t xml:space="preserve"> </w:t>
             </w:r>
-            <w:hyperlink r:id="rId30">
+            <w:hyperlink r:id="rId32">
               <w:r>
                 <w:rPr>
                   <w:rStyle w:val="Hyperlink"/>
@@ -1964,7 +1938,7 @@
             <w:pPr>
               <w:pStyle w:val="Compact"/>
             </w:pPr>
-            <w:hyperlink r:id="rId31">
+            <w:hyperlink r:id="rId33">
               <w:r>
                 <w:rPr>
                   <w:rStyle w:val="Hyperlink"/>
@@ -1978,7 +1952,7 @@
             <w:r>
               <w:t xml:space="preserve"> </w:t>
             </w:r>
-            <w:hyperlink r:id="rId32">
+            <w:hyperlink r:id="rId34">
               <w:r>
                 <w:rPr>
                   <w:rStyle w:val="Hyperlink"/>
@@ -2048,7 +2022,7 @@
             <w:pPr>
               <w:pStyle w:val="Compact"/>
             </w:pPr>
-            <w:hyperlink r:id="rId33">
+            <w:hyperlink r:id="rId35">
               <w:r>
                 <w:rPr>
                   <w:rStyle w:val="Hyperlink"/>
@@ -2062,7 +2036,7 @@
             <w:r>
               <w:t xml:space="preserve"> </w:t>
             </w:r>
-            <w:hyperlink r:id="rId34">
+            <w:hyperlink r:id="rId36">
               <w:r>
                 <w:rPr>
                   <w:rStyle w:val="Hyperlink"/>
@@ -2132,7 +2106,7 @@
             <w:pPr>
               <w:pStyle w:val="Compact"/>
             </w:pPr>
-            <w:hyperlink r:id="rId35">
+            <w:hyperlink r:id="rId37">
               <w:r>
                 <w:rPr>
                   <w:rStyle w:val="Hyperlink"/>
@@ -2146,7 +2120,7 @@
             <w:r>
               <w:t xml:space="preserve"> </w:t>
             </w:r>
-            <w:hyperlink r:id="rId36">
+            <w:hyperlink r:id="rId38">
               <w:r>
                 <w:rPr>
                   <w:rStyle w:val="Hyperlink"/>
@@ -2216,7 +2190,7 @@
             <w:pPr>
               <w:pStyle w:val="Compact"/>
             </w:pPr>
-            <w:hyperlink r:id="rId37">
+            <w:hyperlink r:id="rId39">
               <w:r>
                 <w:rPr>
                   <w:rStyle w:val="Hyperlink"/>
@@ -2286,7 +2260,7 @@
             <w:pPr>
               <w:pStyle w:val="Compact"/>
             </w:pPr>
-            <w:hyperlink r:id="rId38">
+            <w:hyperlink r:id="rId40">
               <w:r>
                 <w:rPr>
                   <w:rStyle w:val="Hyperlink"/>
@@ -2315,7 +2289,7 @@
       <w:r>
         <w:t xml:space="preserve">Most providers require 18+ or parental consent. Google requires 16+ in EU (</w:t>
       </w:r>
-      <w:hyperlink r:id="rId39">
+      <w:hyperlink r:id="rId41">
         <w:r>
           <w:rPr>
             <w:rStyle w:val="Hyperlink"/>
@@ -2327,8 +2301,8 @@
         <w:t xml:space="preserve">). Address this in registration.</w:t>
       </w:r>
     </w:p>
-    <w:bookmarkEnd w:id="40"/>
-    <w:bookmarkStart w:id="67" w:name="layer-2-sponsored-credits-apply-now"/>
+    <w:bookmarkEnd w:id="42"/>
+    <w:bookmarkStart w:id="69" w:name="layer-2-sponsored-credits-apply-now"/>
     <w:p>
       <w:pPr>
         <w:pStyle w:val="Heading3"/>
@@ -2456,7 +2430,7 @@
             <w:pPr>
               <w:pStyle w:val="Compact"/>
             </w:pPr>
-            <w:hyperlink r:id="rId41">
+            <w:hyperlink r:id="rId43">
               <w:r>
                 <w:rPr>
                   <w:rStyle w:val="Hyperlink"/>
@@ -2504,7 +2478,7 @@
             <w:pPr>
               <w:pStyle w:val="Compact"/>
             </w:pPr>
-            <w:hyperlink r:id="rId42">
+            <w:hyperlink r:id="rId44">
               <w:r>
                 <w:rPr>
                   <w:rStyle w:val="Hyperlink"/>
@@ -2518,7 +2492,7 @@
             <w:r>
               <w:t xml:space="preserve"> </w:t>
             </w:r>
-            <w:hyperlink r:id="rId43">
+            <w:hyperlink r:id="rId45">
               <w:r>
                 <w:rPr>
                   <w:rStyle w:val="Hyperlink"/>
@@ -2562,7 +2536,7 @@
             <w:pPr>
               <w:pStyle w:val="Compact"/>
             </w:pPr>
-            <w:hyperlink r:id="rId44">
+            <w:hyperlink r:id="rId46">
               <w:r>
                 <w:rPr>
                   <w:rStyle w:val="Hyperlink"/>
@@ -2604,7 +2578,7 @@
             <w:pPr>
               <w:pStyle w:val="Compact"/>
             </w:pPr>
-            <w:hyperlink r:id="rId45">
+            <w:hyperlink r:id="rId47">
               <w:r>
                 <w:rPr>
                   <w:rStyle w:val="Hyperlink"/>
@@ -2648,7 +2622,7 @@
             <w:pPr>
               <w:pStyle w:val="Compact"/>
             </w:pPr>
-            <w:hyperlink r:id="rId46">
+            <w:hyperlink r:id="rId48">
               <w:r>
                 <w:rPr>
                   <w:rStyle w:val="Hyperlink"/>
@@ -2686,7 +2660,7 @@
             <w:pPr>
               <w:pStyle w:val="Compact"/>
             </w:pPr>
-            <w:hyperlink r:id="rId47">
+            <w:hyperlink r:id="rId49">
               <w:r>
                 <w:rPr>
                   <w:rStyle w:val="Hyperlink"/>
@@ -2700,7 +2674,7 @@
             <w:r>
               <w:t xml:space="preserve"> </w:t>
             </w:r>
-            <w:hyperlink r:id="rId48">
+            <w:hyperlink r:id="rId50">
               <w:r>
                 <w:rPr>
                   <w:rStyle w:val="Hyperlink"/>
@@ -2750,7 +2724,7 @@
             <w:r>
               <w:t xml:space="preserve"> </w:t>
             </w:r>
-            <w:hyperlink r:id="rId49">
+            <w:hyperlink r:id="rId51">
               <w:r>
                 <w:rPr>
                   <w:rStyle w:val="Hyperlink"/>
@@ -2795,7 +2769,7 @@
             <w:pPr>
               <w:pStyle w:val="Compact"/>
             </w:pPr>
-            <w:hyperlink r:id="rId50">
+            <w:hyperlink r:id="rId52">
               <w:r>
                 <w:rPr>
                   <w:rStyle w:val="Hyperlink"/>
@@ -2809,7 +2783,7 @@
             <w:r>
               <w:t xml:space="preserve"> </w:t>
             </w:r>
-            <w:hyperlink r:id="rId51">
+            <w:hyperlink r:id="rId53">
               <w:r>
                 <w:rPr>
                   <w:rStyle w:val="Hyperlink"/>
@@ -2853,7 +2827,7 @@
             <w:pPr>
               <w:pStyle w:val="Compact"/>
             </w:pPr>
-            <w:hyperlink r:id="rId52">
+            <w:hyperlink r:id="rId54">
               <w:r>
                 <w:rPr>
                   <w:rStyle w:val="Hyperlink"/>
@@ -2891,7 +2865,7 @@
             <w:pPr>
               <w:pStyle w:val="Compact"/>
             </w:pPr>
-            <w:hyperlink r:id="rId53">
+            <w:hyperlink r:id="rId55">
               <w:r>
                 <w:rPr>
                   <w:rStyle w:val="Hyperlink"/>
@@ -2935,7 +2909,7 @@
             <w:pPr>
               <w:pStyle w:val="Compact"/>
             </w:pPr>
-            <w:hyperlink r:id="rId54">
+            <w:hyperlink r:id="rId56">
               <w:r>
                 <w:rPr>
                   <w:rStyle w:val="Hyperlink"/>
@@ -2952,7 +2926,7 @@
             <w:r>
               <w:t xml:space="preserve"> </w:t>
             </w:r>
-            <w:hyperlink r:id="rId55">
+            <w:hyperlink r:id="rId57">
               <w:r>
                 <w:rPr>
                   <w:rStyle w:val="Hyperlink"/>
@@ -3000,7 +2974,7 @@
             <w:pPr>
               <w:pStyle w:val="Compact"/>
             </w:pPr>
-            <w:hyperlink r:id="rId56">
+            <w:hyperlink r:id="rId58">
               <w:r>
                 <w:rPr>
                   <w:rStyle w:val="Hyperlink"/>
@@ -3044,7 +3018,7 @@
             <w:pPr>
               <w:pStyle w:val="Compact"/>
             </w:pPr>
-            <w:hyperlink r:id="rId57">
+            <w:hyperlink r:id="rId59">
               <w:r>
                 <w:rPr>
                   <w:rStyle w:val="Hyperlink"/>
@@ -3092,7 +3066,7 @@
             <w:pPr>
               <w:pStyle w:val="Compact"/>
             </w:pPr>
-            <w:hyperlink r:id="rId58">
+            <w:hyperlink r:id="rId60">
               <w:r>
                 <w:rPr>
                   <w:rStyle w:val="Hyperlink"/>
@@ -3106,7 +3080,7 @@
             <w:r>
               <w:t xml:space="preserve"> </w:t>
             </w:r>
-            <w:hyperlink r:id="rId59">
+            <w:hyperlink r:id="rId61">
               <w:r>
                 <w:rPr>
                   <w:rStyle w:val="Hyperlink"/>
@@ -3120,7 +3094,7 @@
             <w:r>
               <w:t xml:space="preserve"> </w:t>
             </w:r>
-            <w:hyperlink r:id="rId60">
+            <w:hyperlink r:id="rId62">
               <w:r>
                 <w:rPr>
                   <w:rStyle w:val="Hyperlink"/>
@@ -3155,7 +3129,7 @@
       <w:r>
         <w:t xml:space="preserve">Mistral is French, investing heavily in EU AI sovereignty (</w:t>
       </w:r>
-      <w:hyperlink r:id="rId61">
+      <w:hyperlink r:id="rId63">
         <w:r>
           <w:rPr>
             <w:rStyle w:val="Hyperlink"/>
@@ -3169,7 +3143,7 @@
       <w:r>
         <w:t xml:space="preserve"> </w:t>
       </w:r>
-      <w:hyperlink r:id="rId62">
+      <w:hyperlink r:id="rId64">
         <w:r>
           <w:rPr>
             <w:rStyle w:val="Hyperlink"/>
@@ -3233,7 +3207,7 @@
       <w:r>
         <w:t xml:space="preserve"> </w:t>
       </w:r>
-      <w:hyperlink r:id="rId63">
+      <w:hyperlink r:id="rId65">
         <w:r>
           <w:rPr>
             <w:rStyle w:val="Hyperlink"/>
@@ -3256,7 +3230,7 @@
       <w:r>
         <w:t xml:space="preserve"> </w:t>
       </w:r>
-      <w:hyperlink r:id="rId64">
+      <w:hyperlink r:id="rId66">
         <w:r>
           <w:rPr>
             <w:rStyle w:val="Hyperlink"/>
@@ -3279,7 +3253,7 @@
       <w:r>
         <w:t xml:space="preserve"> </w:t>
       </w:r>
-      <w:hyperlink r:id="rId65">
+      <w:hyperlink r:id="rId67">
         <w:r>
           <w:rPr>
             <w:rStyle w:val="Hyperlink"/>
@@ -3302,7 +3276,7 @@
       <w:r>
         <w:t xml:space="preserve"> </w:t>
       </w:r>
-      <w:hyperlink r:id="rId66">
+      <w:hyperlink r:id="rId68">
         <w:r>
           <w:rPr>
             <w:rStyle w:val="Hyperlink"/>
@@ -3317,8 +3291,8 @@
         <w:t xml:space="preserve">via new GCP accounts</w:t>
       </w:r>
     </w:p>
-    <w:bookmarkEnd w:id="67"/>
-    <w:bookmarkStart w:id="79" w:name="layer-3-university-credit-programs"/>
+    <w:bookmarkEnd w:id="69"/>
+    <w:bookmarkStart w:id="81" w:name="layer-3-university-credit-programs"/>
     <w:p>
       <w:pPr>
         <w:pStyle w:val="Heading3"/>
@@ -3445,7 +3419,7 @@
             <w:pPr>
               <w:pStyle w:val="Compact"/>
             </w:pPr>
-            <w:hyperlink r:id="rId68">
+            <w:hyperlink r:id="rId70">
               <w:r>
                 <w:rPr>
                   <w:rStyle w:val="Hyperlink"/>
@@ -3464,7 +3438,7 @@
             <w:r>
               <w:t xml:space="preserve">Romania is eligible (</w:t>
             </w:r>
-            <w:hyperlink r:id="rId69">
+            <w:hyperlink r:id="rId71">
               <w:r>
                 <w:rPr>
                   <w:rStyle w:val="Hyperlink"/>
@@ -3478,7 +3452,7 @@
             <w:r>
               <w:t xml:space="preserve"> </w:t>
             </w:r>
-            <w:hyperlink r:id="rId70">
+            <w:hyperlink r:id="rId72">
               <w:r>
                 <w:rPr>
                   <w:rStyle w:val="Hyperlink"/>
@@ -3495,7 +3469,7 @@
             <w:r>
               <w:t xml:space="preserve"> </w:t>
             </w:r>
-            <w:hyperlink r:id="rId71">
+            <w:hyperlink r:id="rId73">
               <w:r>
                 <w:rPr>
                   <w:rStyle w:val="Hyperlink"/>
@@ -3553,7 +3527,7 @@
             <w:pPr>
               <w:pStyle w:val="Compact"/>
             </w:pPr>
-            <w:hyperlink r:id="rId72">
+            <w:hyperlink r:id="rId74">
               <w:r>
                 <w:rPr>
                   <w:rStyle w:val="Hyperlink"/>
@@ -3631,7 +3605,7 @@
             <w:pPr>
               <w:pStyle w:val="Compact"/>
             </w:pPr>
-            <w:hyperlink r:id="rId73">
+            <w:hyperlink r:id="rId75">
               <w:r>
                 <w:rPr>
                   <w:rStyle w:val="Hyperlink"/>
@@ -3653,7 +3627,7 @@
             <w:r>
               <w:t xml:space="preserve"> </w:t>
             </w:r>
-            <w:hyperlink r:id="rId74">
+            <w:hyperlink r:id="rId76">
               <w:r>
                 <w:rPr>
                   <w:rStyle w:val="Hyperlink"/>
@@ -3670,7 +3644,7 @@
             <w:r>
               <w:t xml:space="preserve"> </w:t>
             </w:r>
-            <w:hyperlink r:id="rId75">
+            <w:hyperlink r:id="rId77">
               <w:r>
                 <w:rPr>
                   <w:rStyle w:val="Hyperlink"/>
@@ -3728,7 +3702,7 @@
             <w:pPr>
               <w:pStyle w:val="Compact"/>
             </w:pPr>
-            <w:hyperlink r:id="rId76">
+            <w:hyperlink r:id="rId78">
               <w:r>
                 <w:rPr>
                   <w:rStyle w:val="Hyperlink"/>
@@ -3750,7 +3724,7 @@
             <w:r>
               <w:t xml:space="preserve"> </w:t>
             </w:r>
-            <w:hyperlink r:id="rId77">
+            <w:hyperlink r:id="rId79">
               <w:r>
                 <w:rPr>
                   <w:rStyle w:val="Hyperlink"/>
@@ -3767,7 +3741,7 @@
             <w:r>
               <w:t xml:space="preserve"> </w:t>
             </w:r>
-            <w:hyperlink r:id="rId78">
+            <w:hyperlink r:id="rId80">
               <w:r>
                 <w:rPr>
                   <w:rStyle w:val="Hyperlink"/>
@@ -3790,8 +3764,8 @@
         <w:t xml:space="preserve">Note: Google Cloud and Azure credits give access to Gemini, GPT-4o, Claude, Mistral, and Llama through their respective AI services (Vertex AI, Azure OpenAI, Bedrock).</w:t>
       </w:r>
     </w:p>
-    <w:bookmarkEnd w:id="79"/>
-    <w:bookmarkStart w:id="83" w:name="X031725fad3b1b1e1814e8e0c27fcbbb9849d212"/>
+    <w:bookmarkEnd w:id="81"/>
+    <w:bookmarkStart w:id="85" w:name="X031725fad3b1b1e1814e8e0c27fcbbb9849d212"/>
     <w:p>
       <w:pPr>
         <w:pStyle w:val="Heading3"/>
@@ -3906,7 +3880,7 @@
             <w:pPr>
               <w:pStyle w:val="Compact"/>
             </w:pPr>
-            <w:hyperlink r:id="rId80">
+            <w:hyperlink r:id="rId82">
               <w:r>
                 <w:rPr>
                   <w:rStyle w:val="Hyperlink"/>
@@ -3920,7 +3894,7 @@
             <w:r>
               <w:t xml:space="preserve"> </w:t>
             </w:r>
-            <w:hyperlink r:id="rId81">
+            <w:hyperlink r:id="rId83">
               <w:r>
                 <w:rPr>
                   <w:rStyle w:val="Hyperlink"/>
@@ -3975,7 +3949,7 @@
             <w:pPr>
               <w:pStyle w:val="Compact"/>
             </w:pPr>
-            <w:hyperlink r:id="rId82">
+            <w:hyperlink r:id="rId84">
               <w:r>
                 <w:rPr>
                   <w:rStyle w:val="Hyperlink"/>
@@ -4030,7 +4004,7 @@
             <w:pPr>
               <w:pStyle w:val="Compact"/>
             </w:pPr>
-            <w:hyperlink r:id="rId21">
+            <w:hyperlink r:id="rId23">
               <w:r>
                 <w:rPr>
                   <w:rStyle w:val="Hyperlink"/>
@@ -4042,8 +4016,8 @@
         </w:tc>
       </w:tr>
     </w:tbl>
-    <w:bookmarkEnd w:id="83"/>
-    <w:bookmarkStart w:id="87" w:name="X0f0c4576d0a4886b03a9332931719c8bd1438c1"/>
+    <w:bookmarkEnd w:id="85"/>
+    <w:bookmarkStart w:id="89" w:name="X0f0c4576d0a4886b03a9332931719c8bd1438c1"/>
     <w:p>
       <w:pPr>
         <w:pStyle w:val="Heading3"/>
@@ -4090,7 +4064,7 @@
       <w:r>
         <w:t xml:space="preserve"> </w:t>
       </w:r>
-      <w:hyperlink r:id="rId84">
+      <w:hyperlink r:id="rId86">
         <w:r>
           <w:rPr>
             <w:rStyle w:val="Hyperlink"/>
@@ -4107,7 +4081,7 @@
       <w:r>
         <w:t xml:space="preserve"> </w:t>
       </w:r>
-      <w:hyperlink r:id="rId85">
+      <w:hyperlink r:id="rId87">
         <w:r>
           <w:rPr>
             <w:rStyle w:val="Hyperlink"/>
@@ -4121,7 +4095,7 @@
       <w:r>
         <w:t xml:space="preserve"> </w:t>
       </w:r>
-      <w:hyperlink r:id="rId82">
+      <w:hyperlink r:id="rId84">
         <w:r>
           <w:rPr>
             <w:rStyle w:val="Hyperlink"/>
@@ -4555,7 +4529,7 @@
       <w:r>
         <w:t xml:space="preserve"> </w:t>
       </w:r>
-      <w:hyperlink r:id="rId86">
+      <w:hyperlink r:id="rId88">
         <w:r>
           <w:rPr>
             <w:rStyle w:val="Hyperlink"/>
@@ -4585,7 +4559,7 @@
       <w:r>
         <w:t xml:space="preserve">(</w:t>
       </w:r>
-      <w:hyperlink r:id="rId27">
+      <w:hyperlink r:id="rId29">
         <w:r>
           <w:rPr>
             <w:rStyle w:val="Hyperlink"/>
@@ -4597,8 +4571,8 @@
         <w:t xml:space="preserve">) — covers the entire event at paid rates.</w:t>
       </w:r>
     </w:p>
-    <w:bookmarkEnd w:id="87"/>
-    <w:bookmarkStart w:id="88" w:name="open-questions-credits"/>
+    <w:bookmarkEnd w:id="89"/>
+    <w:bookmarkStart w:id="90" w:name="open-questions-credits"/>
     <w:p>
       <w:pPr>
         <w:pStyle w:val="Heading3"/>
@@ -4677,7 +4651,7 @@
               <w:pStyle w:val="Compact"/>
             </w:pPr>
             <w:r>
-              <w:t xml:space="preserve">11</w:t>
+              <w:t xml:space="preserve">7</w:t>
             </w:r>
           </w:p>
         </w:tc>
@@ -4727,7 +4701,7 @@
               <w:pStyle w:val="Compact"/>
             </w:pPr>
             <w:r>
-              <w:t xml:space="preserve">12</w:t>
+              <w:t xml:space="preserve">8</w:t>
             </w:r>
           </w:p>
         </w:tc>
@@ -4777,7 +4751,7 @@
               <w:pStyle w:val="Compact"/>
             </w:pPr>
             <w:r>
-              <w:t xml:space="preserve">13</w:t>
+              <w:t xml:space="preserve">9</w:t>
             </w:r>
           </w:p>
         </w:tc>
@@ -4803,7 +4777,7 @@
               <w:pStyle w:val="Compact"/>
             </w:pPr>
             <w:r>
-              <w:t xml:space="preserve">A) Require parental consent forms for all account creation. B) Organizers create shared accounts and distribute keys. C) Focus on providers with no age restriction or lower thresholds.</w:t>
+              <w:t xml:space="preserve">A) Require parental consent forms for all account creation. B) Organizers create shared accounts and distribute keys. C) Use university GPU clusters (no external accounts needed).</w:t>
             </w:r>
           </w:p>
         </w:tc>
@@ -4827,9 +4801,9 @@
         </w:pict>
       </w:r>
     </w:p>
-    <w:bookmarkEnd w:id="88"/>
-    <w:bookmarkEnd w:id="89"/>
-    <w:bookmarkStart w:id="91" w:name="participant-logistics"/>
+    <w:bookmarkEnd w:id="90"/>
+    <w:bookmarkEnd w:id="91"/>
+    <w:bookmarkStart w:id="93" w:name="participant-logistics"/>
     <w:p>
       <w:pPr>
         <w:pStyle w:val="Heading2"/>
@@ -4838,7 +4812,7 @@
         <w:t xml:space="preserve">5. Participant Logistics</w:t>
       </w:r>
     </w:p>
-    <w:bookmarkStart w:id="90" w:name="open-questions-logistics"/>
+    <w:bookmarkStart w:id="92" w:name="open-questions-logistics"/>
     <w:p>
       <w:pPr>
         <w:pStyle w:val="Heading3"/>
@@ -4917,7 +4891,7 @@
               <w:pStyle w:val="Compact"/>
             </w:pPr>
             <w:r>
-              <w:t xml:space="preserve">14</w:t>
+              <w:t xml:space="preserve">10</w:t>
             </w:r>
           </w:p>
         </w:tc>
@@ -4964,7 +4938,7 @@
               <w:pStyle w:val="Compact"/>
             </w:pPr>
             <w:r>
-              <w:t xml:space="preserve">15</w:t>
+              <w:t xml:space="preserve">11</w:t>
             </w:r>
           </w:p>
         </w:tc>
@@ -5020,7 +4994,7 @@
               <w:pStyle w:val="Compact"/>
             </w:pPr>
             <w:r>
-              <w:t xml:space="preserve">16</w:t>
+              <w:t xml:space="preserve">12</w:t>
             </w:r>
           </w:p>
         </w:tc>
@@ -5067,7 +5041,7 @@
               <w:pStyle w:val="Compact"/>
             </w:pPr>
             <w:r>
-              <w:t xml:space="preserve">17</w:t>
+              <w:t xml:space="preserve">13</w:t>
             </w:r>
           </w:p>
         </w:tc>
@@ -5123,9 +5097,9 @@
         </w:pict>
       </w:r>
     </w:p>
-    <w:bookmarkEnd w:id="90"/>
-    <w:bookmarkEnd w:id="91"/>
-    <w:bookmarkStart w:id="95" w:name="ecosystem-context"/>
+    <w:bookmarkEnd w:id="92"/>
+    <w:bookmarkEnd w:id="93"/>
+    <w:bookmarkStart w:id="97" w:name="ecosystem-context"/>
     <w:p>
       <w:pPr>
         <w:pStyle w:val="Heading2"/>
@@ -5134,7 +5108,7 @@
         <w:t xml:space="preserve">6. Ecosystem Context</w:t>
       </w:r>
     </w:p>
-    <w:bookmarkStart w:id="92" w:name="timisoara-hackathon-scene"/>
+    <w:bookmarkStart w:id="94" w:name="timisoara-hackathon-scene"/>
     <w:p>
       <w:pPr>
         <w:pStyle w:val="Heading3"/>
@@ -5148,7 +5122,7 @@
         <w:pStyle w:val="Compact"/>
         <w:numPr>
           <w:ilvl w:val="0"/>
-          <w:numId w:val="1001"/>
+          <w:numId w:val="1003"/>
         </w:numPr>
       </w:pPr>
       <w:r>
@@ -5182,7 +5156,7 @@
         <w:pStyle w:val="Compact"/>
         <w:numPr>
           <w:ilvl w:val="0"/>
-          <w:numId w:val="1001"/>
+          <w:numId w:val="1003"/>
         </w:numPr>
       </w:pPr>
       <w:r>
@@ -5204,7 +5178,7 @@
         <w:pStyle w:val="Compact"/>
         <w:numPr>
           <w:ilvl w:val="0"/>
-          <w:numId w:val="1001"/>
+          <w:numId w:val="1003"/>
         </w:numPr>
       </w:pPr>
       <w:r>
@@ -5221,8 +5195,8 @@
         <w:t xml:space="preserve">UVT/OSUT student org, 48hr hackathon within festival</w:t>
       </w:r>
     </w:p>
-    <w:bookmarkEnd w:id="92"/>
-    <w:bookmarkStart w:id="93" w:name="romanian-ai-competition-pipeline"/>
+    <w:bookmarkEnd w:id="94"/>
+    <w:bookmarkStart w:id="95" w:name="romanian-ai-competition-pipeline"/>
     <w:p>
       <w:pPr>
         <w:pStyle w:val="Heading3"/>
@@ -5236,7 +5210,7 @@
         <w:pStyle w:val="Compact"/>
         <w:numPr>
           <w:ilvl w:val="0"/>
-          <w:numId w:val="1002"/>
+          <w:numId w:val="1004"/>
         </w:numPr>
       </w:pPr>
       <w:r>
@@ -5258,7 +5232,7 @@
         <w:pStyle w:val="Compact"/>
         <w:numPr>
           <w:ilvl w:val="0"/>
-          <w:numId w:val="1002"/>
+          <w:numId w:val="1004"/>
         </w:numPr>
       </w:pPr>
       <w:r>
@@ -5280,7 +5254,7 @@
         <w:pStyle w:val="Compact"/>
         <w:numPr>
           <w:ilvl w:val="0"/>
-          <w:numId w:val="1002"/>
+          <w:numId w:val="1004"/>
         </w:numPr>
       </w:pPr>
       <w:r>
@@ -5297,8 +5271,8 @@
         <w:t xml:space="preserve">Inaugural Central European AI Olympiad, July 14-19 in Cluj-Napoca.</w:t>
       </w:r>
     </w:p>
-    <w:bookmarkEnd w:id="93"/>
-    <w:bookmarkStart w:id="94" w:name="our-differentiation"/>
+    <w:bookmarkEnd w:id="95"/>
+    <w:bookmarkStart w:id="96" w:name="our-differentiation"/>
     <w:p>
       <w:pPr>
         <w:pStyle w:val="Heading3"/>
@@ -5338,9 +5312,9 @@
         </w:pict>
       </w:r>
     </w:p>
-    <w:bookmarkEnd w:id="94"/>
-    <w:bookmarkEnd w:id="95"/>
-    <w:bookmarkStart w:id="101" w:name="action-items"/>
+    <w:bookmarkEnd w:id="96"/>
+    <w:bookmarkEnd w:id="97"/>
+    <w:bookmarkStart w:id="103" w:name="action-items"/>
     <w:p>
       <w:pPr>
         <w:pStyle w:val="Heading2"/>
@@ -5349,7 +5323,7 @@
         <w:t xml:space="preserve">7. Action Items</w:t>
       </w:r>
     </w:p>
-    <w:bookmarkStart w:id="96" w:name="p0-this-week-by-april-7"/>
+    <w:bookmarkStart w:id="98" w:name="p0-this-week-by-april-7"/>
     <w:p>
       <w:pPr>
         <w:pStyle w:val="Heading3"/>
@@ -5664,8 +5638,8 @@
         </w:tc>
       </w:tr>
     </w:tbl>
-    <w:bookmarkEnd w:id="96"/>
-    <w:bookmarkStart w:id="97" w:name="p0-next-week-by-april-14"/>
+    <w:bookmarkEnd w:id="98"/>
+    <w:bookmarkStart w:id="99" w:name="p0-next-week-by-april-14"/>
     <w:p>
       <w:pPr>
         <w:pStyle w:val="Heading3"/>
@@ -5897,8 +5871,8 @@
         </w:tc>
       </w:tr>
     </w:tbl>
-    <w:bookmarkEnd w:id="97"/>
-    <w:bookmarkStart w:id="98" w:name="p1-by-april-20"/>
+    <w:bookmarkEnd w:id="99"/>
+    <w:bookmarkStart w:id="100" w:name="p1-by-april-20"/>
     <w:p>
       <w:pPr>
         <w:pStyle w:val="Heading3"/>
@@ -6129,8 +6103,8 @@
         </w:tc>
       </w:tr>
     </w:tbl>
-    <w:bookmarkEnd w:id="98"/>
-    <w:bookmarkStart w:id="99" w:name="p2-by-may-1"/>
+    <w:bookmarkEnd w:id="100"/>
+    <w:bookmarkStart w:id="101" w:name="p2-by-may-1"/>
     <w:p>
       <w:pPr>
         <w:pStyle w:val="Heading3"/>
@@ -6322,8 +6296,8 @@
         </w:tc>
       </w:tr>
     </w:tbl>
-    <w:bookmarkEnd w:id="99"/>
-    <w:bookmarkStart w:id="100" w:name="p2-pre-event-may-114"/>
+    <w:bookmarkEnd w:id="101"/>
+    <w:bookmarkStart w:id="102" w:name="p2-pre-event-may-114"/>
     <w:p>
       <w:pPr>
         <w:pStyle w:val="Heading3"/>
@@ -6595,9 +6569,9 @@
         </w:tc>
       </w:tr>
     </w:tbl>
-    <w:bookmarkEnd w:id="100"/>
-    <w:bookmarkEnd w:id="101"/>
     <w:bookmarkEnd w:id="102"/>
+    <w:bookmarkEnd w:id="103"/>
+    <w:bookmarkEnd w:id="104"/>
     <w:sectPr>
       <w:footnotePr>
         <w:numRestart w:val="eachSect"/>
@@ -6818,6 +6792,12 @@
     <w:abstractNumId w:val="991"/>
   </w:num>
   <w:num w:numId="1002">
+    <w:abstractNumId w:val="991"/>
+  </w:num>
+  <w:num w:numId="1003">
+    <w:abstractNumId w:val="991"/>
+  </w:num>
+  <w:num w:numId="1004">
     <w:abstractNumId w:val="991"/>
   </w:num>
 </w:numbering>

</xml_diff>

<commit_message>
Format header as table for clean Google Docs rendering
Co-Authored-By: Claude Opus 4.6 (1M context) <noreply@anthropic.com>
</commit_message>
<xml_diff>
--- a/docs/hackathon-planning.docx
+++ b/docs/hackathon-planning.docx
@@ -11,109 +11,190 @@
         <w:t xml:space="preserve">Agentic Programming Hackathon</w:t>
       </w:r>
     </w:p>
-    <w:p>
-      <w:pPr>
-        <w:pStyle w:val="FirstParagraph"/>
-      </w:pPr>
-      <w:r>
-        <w:rPr>
-          <w:b/>
-          <w:bCs/>
-        </w:rPr>
-        <w:t xml:space="preserve">Organizers:</w:t>
-      </w:r>
-      <w:r>
-        <w:t xml:space="preserve"> </w:t>
-      </w:r>
-      <w:r>
-        <w:t xml:space="preserve">agentic.tm, UPT, UVT</w:t>
-      </w:r>
-      <w:r>
-        <w:t xml:space="preserve"> </w:t>
-      </w:r>
-      <w:r>
-        <w:rPr>
-          <w:b/>
-          <w:bCs/>
-        </w:rPr>
-        <w:t xml:space="preserve">Part of:</w:t>
-      </w:r>
-      <w:r>
-        <w:t xml:space="preserve"> </w:t>
-      </w:r>
-      <w:hyperlink r:id="rId9">
-        <w:r>
-          <w:rPr>
-            <w:rStyle w:val="Hyperlink"/>
-          </w:rPr>
-          <w:t xml:space="preserve">olimpiada-ai.ro</w:t>
-        </w:r>
-      </w:hyperlink>
-      <w:r>
-        <w:t xml:space="preserve"> </w:t>
-      </w:r>
-      <w:r>
-        <w:rPr>
-          <w:b/>
-          <w:bCs/>
-        </w:rPr>
-        <w:t xml:space="preserve">Date:</w:t>
-      </w:r>
-      <w:r>
-        <w:t xml:space="preserve"> </w:t>
-      </w:r>
-      <w:r>
-        <w:t xml:space="preserve">May 15–17, 2026</w:t>
-      </w:r>
-      <w:r>
-        <w:t xml:space="preserve"> </w:t>
-      </w:r>
-      <w:r>
-        <w:rPr>
-          <w:b/>
-          <w:bCs/>
-        </w:rPr>
-        <w:t xml:space="preserve">Venue:</w:t>
-      </w:r>
-      <w:r>
-        <w:t xml:space="preserve"> </w:t>
-      </w:r>
-      <w:r>
-        <w:t xml:space="preserve">TBD (Timisoara)</w:t>
-      </w:r>
-      <w:r>
-        <w:t xml:space="preserve"> </w:t>
-      </w:r>
-      <w:r>
-        <w:rPr>
-          <w:b/>
-          <w:bCs/>
-        </w:rPr>
-        <w:t xml:space="preserve">Participants:</w:t>
-      </w:r>
-      <w:r>
-        <w:t xml:space="preserve"> </w:t>
-      </w:r>
-      <w:r>
-        <w:t xml:space="preserve">~100 high school students, Romania west region</w:t>
-      </w:r>
-      <w:r>
-        <w:t xml:space="preserve"> </w:t>
-      </w:r>
-      <w:r>
-        <w:rPr>
-          <w:b/>
-          <w:bCs/>
-        </w:rPr>
-        <w:t xml:space="preserve">Teams:</w:t>
-      </w:r>
-      <w:r>
-        <w:t xml:space="preserve"> </w:t>
-      </w:r>
-      <w:r>
-        <w:t xml:space="preserve">2–4 members, BYOD</w:t>
-      </w:r>
-    </w:p>
+    <w:tbl>
+      <w:tblPr>
+        <w:tblStyle w:val="Table"/>
+        <w:tblW w:type="auto" w:w="0"/>
+        <w:tblLook w:firstRow="0" w:lastRow="0" w:firstColumn="0" w:lastColumn="0" w:noHBand="0" w:noVBand="0" w:val="0000"/>
+      </w:tblPr>
+      <w:tblGrid>
+        <w:gridCol w:w="3960"/>
+        <w:gridCol w:w="3960"/>
+      </w:tblGrid>
+      <w:tr>
+        <w:tc>
+          <w:tcPr/>
+          <w:p>
+            <w:pPr>
+              <w:pStyle w:val="Compact"/>
+            </w:pPr>
+            <w:r>
+              <w:rPr>
+                <w:b/>
+                <w:bCs/>
+              </w:rPr>
+              <w:t xml:space="preserve">Organizers</w:t>
+            </w:r>
+          </w:p>
+        </w:tc>
+        <w:tc>
+          <w:tcPr/>
+          <w:p>
+            <w:pPr>
+              <w:pStyle w:val="Compact"/>
+            </w:pPr>
+            <w:r>
+              <w:t xml:space="preserve">agentic.tm, UPT, UVT</w:t>
+            </w:r>
+          </w:p>
+        </w:tc>
+      </w:tr>
+      <w:tr>
+        <w:tc>
+          <w:tcPr/>
+          <w:p>
+            <w:pPr>
+              <w:pStyle w:val="Compact"/>
+            </w:pPr>
+            <w:r>
+              <w:rPr>
+                <w:b/>
+                <w:bCs/>
+              </w:rPr>
+              <w:t xml:space="preserve">Part of</w:t>
+            </w:r>
+          </w:p>
+        </w:tc>
+        <w:tc>
+          <w:tcPr/>
+          <w:p>
+            <w:pPr>
+              <w:pStyle w:val="Compact"/>
+            </w:pPr>
+            <w:hyperlink r:id="rId9">
+              <w:r>
+                <w:rPr>
+                  <w:rStyle w:val="Hyperlink"/>
+                </w:rPr>
+                <w:t xml:space="preserve">olimpiada-ai.ro</w:t>
+              </w:r>
+            </w:hyperlink>
+          </w:p>
+        </w:tc>
+      </w:tr>
+      <w:tr>
+        <w:tc>
+          <w:tcPr/>
+          <w:p>
+            <w:pPr>
+              <w:pStyle w:val="Compact"/>
+            </w:pPr>
+            <w:r>
+              <w:rPr>
+                <w:b/>
+                <w:bCs/>
+              </w:rPr>
+              <w:t xml:space="preserve">Date</w:t>
+            </w:r>
+          </w:p>
+        </w:tc>
+        <w:tc>
+          <w:tcPr/>
+          <w:p>
+            <w:pPr>
+              <w:pStyle w:val="Compact"/>
+            </w:pPr>
+            <w:r>
+              <w:t xml:space="preserve">May 15–17, 2026</w:t>
+            </w:r>
+          </w:p>
+        </w:tc>
+      </w:tr>
+      <w:tr>
+        <w:tc>
+          <w:tcPr/>
+          <w:p>
+            <w:pPr>
+              <w:pStyle w:val="Compact"/>
+            </w:pPr>
+            <w:r>
+              <w:rPr>
+                <w:b/>
+                <w:bCs/>
+              </w:rPr>
+              <w:t xml:space="preserve">Venue</w:t>
+            </w:r>
+          </w:p>
+        </w:tc>
+        <w:tc>
+          <w:tcPr/>
+          <w:p>
+            <w:pPr>
+              <w:pStyle w:val="Compact"/>
+            </w:pPr>
+            <w:r>
+              <w:t xml:space="preserve">TBD (Timisoara)</w:t>
+            </w:r>
+          </w:p>
+        </w:tc>
+      </w:tr>
+      <w:tr>
+        <w:tc>
+          <w:tcPr/>
+          <w:p>
+            <w:pPr>
+              <w:pStyle w:val="Compact"/>
+            </w:pPr>
+            <w:r>
+              <w:rPr>
+                <w:b/>
+                <w:bCs/>
+              </w:rPr>
+              <w:t xml:space="preserve">Participants</w:t>
+            </w:r>
+          </w:p>
+        </w:tc>
+        <w:tc>
+          <w:tcPr/>
+          <w:p>
+            <w:pPr>
+              <w:pStyle w:val="Compact"/>
+            </w:pPr>
+            <w:r>
+              <w:t xml:space="preserve">~100 high school students, Romania west region</w:t>
+            </w:r>
+          </w:p>
+        </w:tc>
+      </w:tr>
+      <w:tr>
+        <w:tc>
+          <w:tcPr/>
+          <w:p>
+            <w:pPr>
+              <w:pStyle w:val="Compact"/>
+            </w:pPr>
+            <w:r>
+              <w:rPr>
+                <w:b/>
+                <w:bCs/>
+              </w:rPr>
+              <w:t xml:space="preserve">Teams</w:t>
+            </w:r>
+          </w:p>
+        </w:tc>
+        <w:tc>
+          <w:tcPr/>
+          <w:p>
+            <w:pPr>
+              <w:pStyle w:val="Compact"/>
+            </w:pPr>
+            <w:r>
+              <w:t xml:space="preserve">2–4 members, BYOD</w:t>
+            </w:r>
+          </w:p>
+        </w:tc>
+      </w:tr>
+    </w:tbl>
     <w:p>
       <w:r>
         <w:pict>

</xml_diff>

<commit_message>
Elevate HUMAN IN THE LOOP as the hackathon theme
Not just a constraint — it's the central concept. Agents that work
with humans, not instead of them. Propose/decide, draft/refine,
act/supervise.

Co-Authored-By: Claude Opus 4.6 (1M context) <noreply@anthropic.com>
</commit_message>
<xml_diff>
--- a/docs/hackathon-planning.docx
+++ b/docs/hackathon-planning.docx
@@ -2,7 +2,7 @@
 <file path=word/document.xml><?xml version="1.0" encoding="utf-8"?>
 <w:document xmlns:w="http://schemas.openxmlformats.org/wordprocessingml/2006/main" xmlns:m="http://schemas.openxmlformats.org/officeDocument/2006/math" xmlns:r="http://schemas.openxmlformats.org/officeDocument/2006/relationships" xmlns:o="urn:schemas-microsoft-com:office:office" xmlns:v="urn:schemas-microsoft-com:vml" xmlns:w10="urn:schemas-microsoft-com:office:word" xmlns:a="http://schemas.openxmlformats.org/drawingml/2006/main" xmlns:pic="http://schemas.openxmlformats.org/drawingml/2006/picture" xmlns:wp="http://schemas.openxmlformats.org/drawingml/2006/wordprocessingDrawing">
   <w:body>
-    <w:bookmarkStart w:id="32" w:name="agentic-programming-hackathon"/>
+    <w:bookmarkStart w:id="33" w:name="agentic-programming-hackathon"/>
     <w:p>
       <w:pPr>
         <w:pStyle w:val="Heading1"/>
@@ -202,13 +202,22 @@
         </w:pict>
       </w:r>
     </w:p>
-    <w:bookmarkStart w:id="11" w:name="concept"/>
+    <w:bookmarkStart w:id="12" w:name="concept"/>
     <w:p>
       <w:pPr>
         <w:pStyle w:val="Heading2"/>
       </w:pPr>
       <w:r>
         <w:t xml:space="preserve">Concept</w:t>
+      </w:r>
+    </w:p>
+    <w:bookmarkStart w:id="10" w:name="theme-human-in-the-loop"/>
+    <w:p>
+      <w:pPr>
+        <w:pStyle w:val="Heading3"/>
+      </w:pPr>
+      <w:r>
+        <w:t xml:space="preserve">Theme: HUMAN IN THE LOOP</w:t>
       </w:r>
     </w:p>
     <w:p>
@@ -216,7 +225,7 @@
         <w:pStyle w:val="FirstParagraph"/>
       </w:pPr>
       <w:r>
-        <w:t xml:space="preserve">High school students build</w:t>
+        <w:t xml:space="preserve">The central theme of this hackathon is</w:t>
       </w:r>
       <w:r>
         <w:t xml:space="preserve"> </w:t>
@@ -226,13 +235,29 @@
           <w:b/>
           <w:bCs/>
         </w:rPr>
-        <w:t xml:space="preserve">human-in-the-loop AI agents</w:t>
+        <w:t xml:space="preserve">Human in the Loop</w:t>
       </w:r>
       <w:r>
         <w:t xml:space="preserve"> </w:t>
       </w:r>
       <w:r>
-        <w:t xml:space="preserve">using LLM APIs over a weekend.</w:t>
+        <w:t xml:space="preserve">— building AI agents that work</w:t>
+      </w:r>
+      <w:r>
+        <w:t xml:space="preserve"> </w:t>
+      </w:r>
+      <w:r>
+        <w:rPr>
+          <w:i/>
+          <w:iCs/>
+        </w:rPr>
+        <w:t xml:space="preserve">with</w:t>
+      </w:r>
+      <w:r>
+        <w:t xml:space="preserve"> </w:t>
+      </w:r>
+      <w:r>
+        <w:t xml:space="preserve">humans, not instead of them.</w:t>
       </w:r>
     </w:p>
     <w:p>
@@ -240,7 +265,7 @@
         <w:pStyle w:val="BodyText"/>
       </w:pPr>
       <w:r>
-        <w:t xml:space="preserve">Not chatbots. Not prompt wrappers. Agents that reason, use tools, and take actions — with a human guiding, reviewing, or collaborating at key points. Students get API credits from multiple providers and choose their own stack.</w:t>
+        <w:t xml:space="preserve">Students build agents that reason, plan, use tools, and take actions — but with a human guiding, reviewing, approving, or collaborating at critical points. The agent proposes, the human decides. The agent drafts, the human refines. The agent acts, the human supervises.</w:t>
       </w:r>
     </w:p>
     <w:p>
@@ -248,23 +273,19 @@
         <w:pStyle w:val="BodyText"/>
       </w:pPr>
       <w:r>
-        <w:t xml:space="preserve">No other Romanian event teaches students to</w:t>
-      </w:r>
-      <w:r>
-        <w:t xml:space="preserve"> </w:t>
-      </w:r>
-      <w:r>
-        <w:rPr>
-          <w:b/>
-          <w:bCs/>
-        </w:rPr>
-        <w:t xml:space="preserve">build with LLM APIs</w:t>
-      </w:r>
-      <w:r>
-        <w:t xml:space="preserve">. ONIA trains ML models. UniHack/HackTM are general tech. This fills a real gap.</w:t>
+        <w:t xml:space="preserve">This isn’t a constraint — it’s the point. The most powerful AI systems in production today are human-in-the-loop. Teaching students this from day one sets them apart.</w:t>
       </w:r>
     </w:p>
-    <w:bookmarkStart w:id="10" w:name="what-we-need-to-finalize"/>
+    <w:p>
+      <w:pPr>
+        <w:pStyle w:val="BodyText"/>
+      </w:pPr>
+      <w:r>
+        <w:t xml:space="preserve">Students get API credits from multiple providers and choose their own stack. No restrictions on tools or models.</w:t>
+      </w:r>
+    </w:p>
+    <w:bookmarkEnd w:id="10"/>
+    <w:bookmarkStart w:id="11" w:name="what-we-need-to-finalize"/>
     <w:p>
       <w:pPr>
         <w:pStyle w:val="Heading3"/>
@@ -649,9 +670,9 @@
         </w:pict>
       </w:r>
     </w:p>
-    <w:bookmarkEnd w:id="10"/>
     <w:bookmarkEnd w:id="11"/>
-    <w:bookmarkStart w:id="12" w:name="mentors"/>
+    <w:bookmarkEnd w:id="12"/>
+    <w:bookmarkStart w:id="13" w:name="mentors"/>
     <w:p>
       <w:pPr>
         <w:pStyle w:val="Heading2"/>
@@ -867,8 +888,8 @@
         </w:pict>
       </w:r>
     </w:p>
-    <w:bookmarkEnd w:id="12"/>
-    <w:bookmarkStart w:id="25" w:name="credits"/>
+    <w:bookmarkEnd w:id="13"/>
+    <w:bookmarkStart w:id="26" w:name="credits"/>
     <w:p>
       <w:pPr>
         <w:pStyle w:val="Heading2"/>
@@ -887,7 +908,7 @@
       <w:r>
         <w:t xml:space="preserve"> </w:t>
       </w:r>
-      <w:hyperlink r:id="rId13">
+      <w:hyperlink r:id="rId14">
         <w:r>
           <w:rPr>
             <w:rStyle w:val="Hyperlink"/>
@@ -990,7 +1011,7 @@
             <w:pPr>
               <w:pStyle w:val="Compact"/>
             </w:pPr>
-            <w:hyperlink r:id="rId14">
+            <w:hyperlink r:id="rId15">
               <w:r>
                 <w:rPr>
                   <w:rStyle w:val="Hyperlink"/>
@@ -1030,7 +1051,7 @@
             <w:pPr>
               <w:pStyle w:val="Compact"/>
             </w:pPr>
-            <w:hyperlink r:id="rId15">
+            <w:hyperlink r:id="rId16">
               <w:r>
                 <w:rPr>
                   <w:rStyle w:val="Hyperlink"/>
@@ -1070,7 +1091,7 @@
             <w:pPr>
               <w:pStyle w:val="Compact"/>
             </w:pPr>
-            <w:hyperlink r:id="rId16">
+            <w:hyperlink r:id="rId17">
               <w:r>
                 <w:rPr>
                   <w:rStyle w:val="Hyperlink"/>
@@ -1110,7 +1131,7 @@
             <w:pPr>
               <w:pStyle w:val="Compact"/>
             </w:pPr>
-            <w:hyperlink r:id="rId17">
+            <w:hyperlink r:id="rId18">
               <w:r>
                 <w:rPr>
                   <w:rStyle w:val="Hyperlink"/>
@@ -1150,7 +1171,7 @@
             <w:pPr>
               <w:pStyle w:val="Compact"/>
             </w:pPr>
-            <w:hyperlink r:id="rId18">
+            <w:hyperlink r:id="rId19">
               <w:r>
                 <w:rPr>
                   <w:rStyle w:val="Hyperlink"/>
@@ -1190,7 +1211,7 @@
             <w:pPr>
               <w:pStyle w:val="Compact"/>
             </w:pPr>
-            <w:hyperlink r:id="rId19">
+            <w:hyperlink r:id="rId20">
               <w:r>
                 <w:rPr>
                   <w:rStyle w:val="Hyperlink"/>
@@ -1324,7 +1345,7 @@
             <w:pPr>
               <w:pStyle w:val="Compact"/>
             </w:pPr>
-            <w:hyperlink r:id="rId20">
+            <w:hyperlink r:id="rId21">
               <w:r>
                 <w:rPr>
                   <w:rStyle w:val="Hyperlink"/>
@@ -1375,7 +1396,7 @@
             <w:pPr>
               <w:pStyle w:val="Compact"/>
             </w:pPr>
-            <w:hyperlink r:id="rId21">
+            <w:hyperlink r:id="rId22">
               <w:r>
                 <w:rPr>
                   <w:rStyle w:val="Hyperlink"/>
@@ -1426,7 +1447,7 @@
             <w:pPr>
               <w:pStyle w:val="Compact"/>
             </w:pPr>
-            <w:hyperlink r:id="rId22">
+            <w:hyperlink r:id="rId23">
               <w:r>
                 <w:rPr>
                   <w:rStyle w:val="Hyperlink"/>
@@ -1477,7 +1498,7 @@
             <w:pPr>
               <w:pStyle w:val="Compact"/>
             </w:pPr>
-            <w:hyperlink r:id="rId23">
+            <w:hyperlink r:id="rId24">
               <w:r>
                 <w:rPr>
                   <w:rStyle w:val="Hyperlink"/>
@@ -1528,7 +1549,7 @@
             <w:pPr>
               <w:pStyle w:val="Compact"/>
             </w:pPr>
-            <w:hyperlink r:id="rId24">
+            <w:hyperlink r:id="rId25">
               <w:r>
                 <w:rPr>
                   <w:rStyle w:val="Hyperlink"/>
@@ -1583,8 +1604,8 @@
         </w:pict>
       </w:r>
     </w:p>
-    <w:bookmarkEnd w:id="25"/>
-    <w:bookmarkStart w:id="31" w:name="action-items"/>
+    <w:bookmarkEnd w:id="26"/>
+    <w:bookmarkStart w:id="32" w:name="action-items"/>
     <w:p>
       <w:pPr>
         <w:pStyle w:val="Heading2"/>
@@ -1593,7 +1614,7 @@
         <w:t xml:space="preserve">Action Items</w:t>
       </w:r>
     </w:p>
-    <w:bookmarkStart w:id="26" w:name="this-week-by-april-7"/>
+    <w:bookmarkStart w:id="27" w:name="this-week-by-april-7"/>
     <w:p>
       <w:pPr>
         <w:pStyle w:val="Heading3"/>
@@ -1903,8 +1924,8 @@
         </w:tc>
       </w:tr>
     </w:tbl>
-    <w:bookmarkEnd w:id="26"/>
-    <w:bookmarkStart w:id="28" w:name="by-april-14"/>
+    <w:bookmarkEnd w:id="27"/>
+    <w:bookmarkStart w:id="29" w:name="by-april-14"/>
     <w:p>
       <w:pPr>
         <w:pStyle w:val="Heading3"/>
@@ -1984,7 +2005,7 @@
             <w:r>
               <w:t xml:space="preserve">UPT/UVT faculty: apply for Google Cloud Teaching Credits (</w:t>
             </w:r>
-            <w:hyperlink r:id="rId27">
+            <w:hyperlink r:id="rId28">
               <w:r>
                 <w:rPr>
                   <w:rStyle w:val="Hyperlink"/>
@@ -2103,8 +2124,8 @@
         </w:tc>
       </w:tr>
     </w:tbl>
-    <w:bookmarkEnd w:id="28"/>
-    <w:bookmarkStart w:id="29" w:name="by-may-1"/>
+    <w:bookmarkEnd w:id="29"/>
+    <w:bookmarkStart w:id="30" w:name="by-may-1"/>
     <w:p>
       <w:pPr>
         <w:pStyle w:val="Heading3"/>
@@ -2227,8 +2248,8 @@
         </w:tc>
       </w:tr>
     </w:tbl>
-    <w:bookmarkEnd w:id="29"/>
-    <w:bookmarkStart w:id="30" w:name="pre-event-may-114"/>
+    <w:bookmarkEnd w:id="30"/>
+    <w:bookmarkStart w:id="31" w:name="pre-event-may-114"/>
     <w:p>
       <w:pPr>
         <w:pStyle w:val="Heading3"/>
@@ -2384,9 +2405,9 @@
         </w:tc>
       </w:tr>
     </w:tbl>
-    <w:bookmarkEnd w:id="30"/>
     <w:bookmarkEnd w:id="31"/>
     <w:bookmarkEnd w:id="32"/>
+    <w:bookmarkEnd w:id="33"/>
     <w:sectPr>
       <w:footnotePr>
         <w:numRestart w:val="eachSect"/>

</xml_diff>

<commit_message>
Add Marius as owner for design (concept, mockups, site, media graphics)
Co-Authored-By: Claude Opus 4.6 (1M context) <noreply@anthropic.com>
</commit_message>
<xml_diff>
--- a/docs/hackathon-planning.docx
+++ b/docs/hackathon-planning.docx
@@ -1782,6 +1782,51 @@
               <w:pStyle w:val="Compact"/>
             </w:pPr>
             <w:r>
+              <w:rPr>
+                <w:b/>
+                <w:bCs/>
+              </w:rPr>
+              <w:t xml:space="preserve">Design</w:t>
+            </w:r>
+            <w:r>
+              <w:t xml:space="preserve"> </w:t>
+            </w:r>
+            <w:r>
+              <w:t xml:space="preserve">— concept, mockups, site, media graphics</w:t>
+            </w:r>
+          </w:p>
+        </w:tc>
+        <w:tc>
+          <w:tcPr/>
+          <w:p>
+            <w:pPr>
+              <w:pStyle w:val="Compact"/>
+            </w:pPr>
+            <w:r>
+              <w:t xml:space="preserve">Marius</w:t>
+            </w:r>
+          </w:p>
+        </w:tc>
+      </w:tr>
+      <w:tr>
+        <w:tc>
+          <w:tcPr/>
+          <w:p>
+            <w:pPr>
+              <w:pStyle w:val="Compact"/>
+            </w:pPr>
+            <w:r>
+              <w:t xml:space="preserve">4</w:t>
+            </w:r>
+          </w:p>
+        </w:tc>
+        <w:tc>
+          <w:tcPr/>
+          <w:p>
+            <w:pPr>
+              <w:pStyle w:val="Compact"/>
+            </w:pPr>
+            <w:r>
               <w:t xml:space="preserve">Apply to OpenAI Hackathon Support</w:t>
             </w:r>
           </w:p>
@@ -1803,7 +1848,7 @@
               <w:pStyle w:val="Compact"/>
             </w:pPr>
             <w:r>
-              <w:t xml:space="preserve">4</w:t>
+              <w:t xml:space="preserve">5</w:t>
             </w:r>
           </w:p>
         </w:tc>
@@ -1835,7 +1880,7 @@
               <w:pStyle w:val="Compact"/>
             </w:pPr>
             <w:r>
-              <w:t xml:space="preserve">5</w:t>
+              <w:t xml:space="preserve">6</w:t>
             </w:r>
           </w:p>
         </w:tc>
@@ -1867,7 +1912,7 @@
               <w:pStyle w:val="Compact"/>
             </w:pPr>
             <w:r>
-              <w:t xml:space="preserve">6</w:t>
+              <w:t xml:space="preserve">7</w:t>
             </w:r>
           </w:p>
         </w:tc>
@@ -1899,7 +1944,7 @@
               <w:pStyle w:val="Compact"/>
             </w:pPr>
             <w:r>
-              <w:t xml:space="preserve">7</w:t>
+              <w:t xml:space="preserve">8</w:t>
             </w:r>
           </w:p>
         </w:tc>
@@ -1992,7 +2037,7 @@
               <w:pStyle w:val="Compact"/>
             </w:pPr>
             <w:r>
-              <w:t xml:space="preserve">8</w:t>
+              <w:t xml:space="preserve">9</w:t>
             </w:r>
           </w:p>
         </w:tc>
@@ -2035,7 +2080,7 @@
               <w:pStyle w:val="Compact"/>
             </w:pPr>
             <w:r>
-              <w:t xml:space="preserve">9</w:t>
+              <w:t xml:space="preserve">10</w:t>
             </w:r>
           </w:p>
         </w:tc>
@@ -2067,7 +2112,7 @@
               <w:pStyle w:val="Compact"/>
             </w:pPr>
             <w:r>
-              <w:t xml:space="preserve">10</w:t>
+              <w:t xml:space="preserve">11</w:t>
             </w:r>
           </w:p>
         </w:tc>
@@ -2099,7 +2144,7 @@
               <w:pStyle w:val="Compact"/>
             </w:pPr>
             <w:r>
-              <w:t xml:space="preserve">11</w:t>
+              <w:t xml:space="preserve">12</w:t>
             </w:r>
           </w:p>
         </w:tc>
@@ -2191,7 +2236,7 @@
               <w:pStyle w:val="Compact"/>
             </w:pPr>
             <w:r>
-              <w:t xml:space="preserve">12</w:t>
+              <w:t xml:space="preserve">13</w:t>
             </w:r>
           </w:p>
         </w:tc>
@@ -2223,7 +2268,7 @@
               <w:pStyle w:val="Compact"/>
             </w:pPr>
             <w:r>
-              <w:t xml:space="preserve">13</w:t>
+              <w:t xml:space="preserve">14</w:t>
             </w:r>
           </w:p>
         </w:tc>
@@ -2316,7 +2361,7 @@
               <w:pStyle w:val="Compact"/>
             </w:pPr>
             <w:r>
-              <w:t xml:space="preserve">14</w:t>
+              <w:t xml:space="preserve">15</w:t>
             </w:r>
           </w:p>
         </w:tc>
@@ -2348,7 +2393,7 @@
               <w:pStyle w:val="Compact"/>
             </w:pPr>
             <w:r>
-              <w:t xml:space="preserve">15</w:t>
+              <w:t xml:space="preserve">16</w:t>
             </w:r>
           </w:p>
         </w:tc>
@@ -2380,7 +2425,7 @@
               <w:pStyle w:val="Compact"/>
             </w:pPr>
             <w:r>
-              <w:t xml:space="preserve">16</w:t>
+              <w:t xml:space="preserve">17</w:t>
             </w:r>
           </w:p>
         </w:tc>

</xml_diff>

<commit_message>
Add CLAUDE.md with no-emdash rule, remove all em/en dashes from planning doc
Co-Authored-By: Claude Opus 4.6 (1M context) <noreply@anthropic.com>
</commit_message>
<xml_diff>
--- a/docs/hackathon-planning.docx
+++ b/docs/hackathon-planning.docx
@@ -105,7 +105,7 @@
               <w:pStyle w:val="Compact"/>
             </w:pPr>
             <w:r>
-              <w:t xml:space="preserve">May 15–17, 2026</w:t>
+              <w:t xml:space="preserve">May 15-17, 2026</w:t>
             </w:r>
           </w:p>
         </w:tc>
@@ -189,7 +189,7 @@
               <w:pStyle w:val="Compact"/>
             </w:pPr>
             <w:r>
-              <w:t xml:space="preserve">2–4 members, BYOD</w:t>
+              <w:t xml:space="preserve">2-4 members, BYOD</w:t>
             </w:r>
           </w:p>
         </w:tc>
@@ -241,7 +241,7 @@
         <w:t xml:space="preserve"> </w:t>
       </w:r>
       <w:r>
-        <w:t xml:space="preserve">— building AI agents that work</w:t>
+        <w:t xml:space="preserve">- building AI agents that work</w:t>
       </w:r>
       <w:r>
         <w:t xml:space="preserve"> </w:t>
@@ -265,7 +265,7 @@
         <w:pStyle w:val="BodyText"/>
       </w:pPr>
       <w:r>
-        <w:t xml:space="preserve">Students build agents that reason, plan, use tools, and take actions — but with a human guiding, reviewing, approving, or collaborating at critical points. The agent proposes, the human decides. The agent drafts, the human refines. The agent acts, the human supervises.</w:t>
+        <w:t xml:space="preserve">Students build agents that reason, plan, use tools, and take actions - but with a human guiding, reviewing, approving, or collaborating at critical points. The agent proposes, the human decides. The agent drafts, the human refines. The agent acts, the human supervises.</w:t>
       </w:r>
     </w:p>
     <w:p>
@@ -273,7 +273,7 @@
         <w:pStyle w:val="BodyText"/>
       </w:pPr>
       <w:r>
-        <w:t xml:space="preserve">This isn’t a constraint — it’s the point. The most powerful AI systems in production today are human-in-the-loop. Teaching students this from day one sets them apart.</w:t>
+        <w:t xml:space="preserve">This isn’t a constraint - it’s the point. The most powerful AI systems in production today are human-in-the-loop. Teaching students this from day one sets them apart.</w:t>
       </w:r>
     </w:p>
     <w:p>
@@ -417,7 +417,7 @@
               <w:pStyle w:val="Compact"/>
             </w:pPr>
             <w:r>
-              <w:t xml:space="preserve">A) Pre-formed only. B) Matchmaking workshop Day 1. C) Mix — register as team or solo.</w:t>
+              <w:t xml:space="preserve">A) Pre-formed only. B) Matchmaking workshop Day 1. C) Mix - register as team or solo.</w:t>
             </w:r>
           </w:p>
         </w:tc>
@@ -501,7 +501,7 @@
               <w:t xml:space="preserve">“build a HITL agent”</w:t>
             </w:r>
             <w:r>
-              <w:t xml:space="preserve">). B) 2–3 specific problems. C) Fully open.</w:t>
+              <w:t xml:space="preserve">). B) 2-3 specific problems. C) Fully open.</w:t>
             </w:r>
           </w:p>
         </w:tc>
@@ -903,7 +903,7 @@
         <w:pStyle w:val="FirstParagraph"/>
       </w:pPr>
       <w:r>
-        <w:t xml:space="preserve">Credits are solved. We need $1,500–3,000 total. Multiple paths available, detailed in</w:t>
+        <w:t xml:space="preserve">Credits are solved. We need $1,500-3,000 total. Multiple paths available, detailed in</w:t>
       </w:r>
       <w:r>
         <w:t xml:space="preserve"> </w:t>
@@ -1228,7 +1228,7 @@
         <w:pStyle w:val="BodyText"/>
       </w:pPr>
       <w:r>
-        <w:t xml:space="preserve">Self-serve alone = ~$14,000 across 100 students. That’s 5–10x what we need.</w:t>
+        <w:t xml:space="preserve">Self-serve alone = ~$14,000 across 100 students. That’s 5-10x what we need.</w:t>
       </w:r>
     </w:p>
     <w:p>
@@ -1702,7 +1702,7 @@
               <w:t xml:space="preserve"> </w:t>
             </w:r>
             <w:r>
-              <w:t xml:space="preserve">— answer questions 1–8 above</w:t>
+              <w:t xml:space="preserve">- answer questions 1-8 above</w:t>
             </w:r>
           </w:p>
         </w:tc>
@@ -1747,7 +1747,7 @@
               <w:t xml:space="preserve"> </w:t>
             </w:r>
             <w:r>
-              <w:t xml:space="preserve">— reach out to agentic.tm, UPT, UVT</w:t>
+              <w:t xml:space="preserve">- reach out to agentic.tm, UPT, UVT</w:t>
             </w:r>
           </w:p>
         </w:tc>
@@ -1792,7 +1792,7 @@
               <w:t xml:space="preserve"> </w:t>
             </w:r>
             <w:r>
-              <w:t xml:space="preserve">— concept, mockups, site, media graphics</w:t>
+              <w:t xml:space="preserve">- concept, mockups, site, media graphics</w:t>
             </w:r>
           </w:p>
         </w:tc>
@@ -2294,13 +2294,13 @@
       </w:tr>
     </w:tbl>
     <w:bookmarkEnd w:id="30"/>
-    <w:bookmarkStart w:id="31" w:name="pre-event-may-114"/>
+    <w:bookmarkStart w:id="31" w:name="pre-event-may-1-14"/>
     <w:p>
       <w:pPr>
         <w:pStyle w:val="Heading3"/>
       </w:pPr>
       <w:r>
-        <w:t xml:space="preserve">Pre-event (May 1–14)</w:t>
+        <w:t xml:space="preserve">Pre-event (May 1-14)</w:t>
       </w:r>
     </w:p>
     <w:tbl>

</xml_diff>